<commit_message>
Archivos csv nuevos y Modificación de archivos
</commit_message>
<xml_diff>
--- a/docs/Guion_Video.docx
+++ b/docs/Guion_Video.docx
@@ -2,50 +2,88 @@
 <file path=word/document.xml><?xml version="1.0" encoding="utf-8"?>
 <w:document xmlns:wpc="http://schemas.microsoft.com/office/word/2010/wordprocessingCanvas" xmlns:mo="http://schemas.microsoft.com/office/mac/office/2008/main" xmlns:mc="http://schemas.openxmlformats.org/markup-compatibility/2006" xmlns:mv="urn:schemas-microsoft-com:mac:vml" xmlns:o="urn:schemas-microsoft-com:office:office" xmlns:r="http://schemas.openxmlformats.org/officeDocument/2006/relationships" xmlns:m="http://schemas.openxmlformats.org/officeDocument/2006/math" xmlns:v="urn:schemas-microsoft-com:vml" xmlns:wp14="http://schemas.microsoft.com/office/word/2010/wordprocessingDrawing" xmlns:wp="http://schemas.openxmlformats.org/drawingml/2006/wordprocessingDrawing" xmlns:w10="urn:schemas-microsoft-com:office:word" xmlns:w="http://schemas.openxmlformats.org/wordprocessingml/2006/main" xmlns:w14="http://schemas.microsoft.com/office/word/2010/wordml" xmlns:wpg="http://schemas.microsoft.com/office/word/2010/wordprocessingGroup" xmlns:wpi="http://schemas.microsoft.com/office/word/2010/wordprocessingInk" xmlns:wne="http://schemas.microsoft.com/office/word/2006/wordml" xmlns:wps="http://schemas.microsoft.com/office/word/2010/wordprocessingShape" mc:Ignorable="w14 wp14">
   <w:body>
-    <w:p/>
-    <w:p/>
     <w:p>
       <w:pPr>
         <w:jc w:val="center"/>
       </w:pPr>
       <w:r>
         <w:rPr>
-          <w:rFonts w:ascii="Calibri" w:hAnsi="Calibri"/>
           <w:b/>
-          <w:color w:val="1F5694"/>
-          <w:sz w:val="52"/>
+          <w:i w:val="0"/>
+          <w:color w:val="1F497D"/>
+          <w:sz w:val="44"/>
         </w:rPr>
-        <w:t>Guión del Video de Presentación</w:t>
+        <w:br/>
+        <w:br/>
+        <w:t>GUION – VIDEO TUTORIAL</w:t>
+        <w:br/>
       </w:r>
-    </w:p>
-    <w:p>
-      <w:pPr>
-        <w:jc w:val="center"/>
-      </w:pPr>
       <w:r>
         <w:rPr>
-          <w:rFonts w:ascii="Calibri" w:hAnsi="Calibri"/>
-          <w:i/>
-          <w:color w:val="2E75B6"/>
+          <w:b/>
+          <w:i w:val="0"/>
+          <w:color w:val="1F497D"/>
           <w:sz w:val="28"/>
         </w:rPr>
-        <w:t>K-QGMIP — Paso a paso: qué hacer y qué decir</w:t>
+        <w:t>K-QGMIP: Extensión de k-particiones para GeoMIP y QNodes</w:t>
+        <w:br/>
+        <w:br/>
       </w:r>
-    </w:p>
-    <w:p/>
-    <w:p>
-      <w:pPr>
-        <w:jc w:val="center"/>
-      </w:pPr>
       <w:r>
         <w:rPr>
-          <w:rFonts w:ascii="Calibri" w:hAnsi="Calibri"/>
+          <w:b w:val="0"/>
+          <w:i w:val="0"/>
+          <w:sz w:val="22"/>
+        </w:rPr>
+        <w:t>Proyecto final · Análisis de Algoritmos</w:t>
+        <w:br/>
+      </w:r>
+      <w:r>
+        <w:rPr>
+          <w:b w:val="0"/>
+          <w:i w:val="0"/>
+          <w:sz w:val="22"/>
+        </w:rPr>
+        <w:t>Universidad de Caldas · 2025</w:t>
+        <w:br/>
+        <w:br/>
+      </w:r>
+      <w:r>
+        <w:rPr>
+          <w:b/>
+          <w:i w:val="0"/>
+          <w:sz w:val="22"/>
+        </w:rPr>
+        <w:t xml:space="preserve">Presentadores: </w:t>
+      </w:r>
+      <w:r>
+        <w:rPr>
+          <w:b w:val="0"/>
+          <w:i w:val="0"/>
+          <w:sz w:val="22"/>
+        </w:rPr>
+        <w:t>Mateo Mejía (P1)  ·  Presentador 2 (P2)</w:t>
+        <w:br/>
+      </w:r>
+      <w:r>
+        <w:rPr>
           <w:b w:val="0"/>
           <w:i/>
-          <w:color w:val="404040"/>
-          <w:sz w:val="22"/>
+          <w:color w:val="7F7F7F"/>
+          <w:sz w:val="20"/>
         </w:rPr>
-        <w:t>Universidad de Caldas  ·  Análisis y Diseño de Algoritmos  ·  2026-1</w:t>
+        <w:t>Duración estimada: ~5 minutos</w:t>
+        <w:br/>
+        <w:br/>
+      </w:r>
+      <w:r>
+        <w:rPr>
+          <w:b w:val="0"/>
+          <w:i/>
+          <w:color w:val="7F7F7F"/>
+          <w:sz w:val="18"/>
+        </w:rPr>
+        <w:t>🟦 Presentador 1 (P1)    🟩 Presentador 2 (P2)    ⬜ Acción en pantalla</w:t>
       </w:r>
     </w:p>
     <w:p>
@@ -56,1491 +94,2353 @@
     <w:p>
       <w:r>
         <w:rPr>
-          <w:rFonts w:ascii="Calibri" w:hAnsi="Calibri"/>
-          <w:b w:val="0"/>
+          <w:b/>
           <w:i w:val="0"/>
-          <w:color w:val="404040"/>
-          <w:sz w:val="22"/>
+          <w:color w:val="1F497D"/>
+          <w:sz w:val="24"/>
         </w:rPr>
-        <w:t>Este guión detalla cada momento del video de presentación del proyecto K-QGMIP. Duración estimada: 8–12 minutos. Grabar desde la terminal, pantalla completa.</w:t>
-      </w:r>
-    </w:p>
-    <w:p>
-      <w:pPr>
-        <w:pStyle w:val="Heading1"/>
-      </w:pPr>
-      <w:r>
-        <w:rPr>
-          <w:rFonts w:ascii="Calibri" w:hAnsi="Calibri"/>
-          <w:color w:val="1F5694"/>
-          <w:sz w:val="32"/>
-        </w:rPr>
-        <w:t>ANTES DE GRABAR — Checklist de preparación</w:t>
+        <w:t>INSTRUCCIONES DE USO DEL GUION</w:t>
+        <w:br/>
       </w:r>
     </w:p>
     <w:p>
       <w:pPr>
         <w:pStyle w:val="ListBullet"/>
-        <w:ind w:left="432"/>
       </w:pPr>
       <w:r>
         <w:rPr>
-          <w:rFonts w:ascii="Calibri" w:hAnsi="Calibri"/>
+          <w:b/>
+          <w:i w:val="0"/>
+          <w:sz w:val="18"/>
+        </w:rPr>
+        <w:t xml:space="preserve">Columna TIEMPO: </w:t>
+      </w:r>
+      <w:r>
+        <w:rPr>
           <w:b w:val="0"/>
           <w:i w:val="0"/>
-          <w:color w:val="404040"/>
-          <w:sz w:val="21"/>
+          <w:sz w:val="18"/>
         </w:rPr>
-        <w:t>Abrir una terminal en la carpeta projecto-analisis-20261/</w:t>
+        <w:t>Marca el inicio aproximado de cada bloque en el video.</w:t>
       </w:r>
     </w:p>
     <w:p>
       <w:pPr>
         <w:pStyle w:val="ListBullet"/>
-        <w:ind w:left="432"/>
       </w:pPr>
       <w:r>
         <w:rPr>
-          <w:rFonts w:ascii="Calibri" w:hAnsi="Calibri"/>
+          <w:b/>
+          <w:i w:val="0"/>
+          <w:sz w:val="18"/>
+        </w:rPr>
+        <w:t xml:space="preserve">Columna PRESENTADOR: </w:t>
+      </w:r>
+      <w:r>
+        <w:rPr>
           <w:b w:val="0"/>
           <w:i w:val="0"/>
-          <w:color w:val="404040"/>
-          <w:sz w:val="21"/>
+          <w:sz w:val="18"/>
         </w:rPr>
-        <w:t>Aumentar el tamaño de fuente de la terminal (mínimo 14pt) para que se vea bien en video.</w:t>
+        <w:t>P1 = Mateo Mejía (azul). P2 = segundo presentador (verde). AMBOS indica que hablan juntos o que cualquiera puede leer.</w:t>
       </w:r>
     </w:p>
     <w:p>
       <w:pPr>
         <w:pStyle w:val="ListBullet"/>
-        <w:ind w:left="432"/>
       </w:pPr>
       <w:r>
         <w:rPr>
-          <w:rFonts w:ascii="Calibri" w:hAnsi="Calibri"/>
+          <w:b/>
+          <w:i w:val="0"/>
+          <w:sz w:val="18"/>
+        </w:rPr>
+        <w:t xml:space="preserve">Columna DIÁLOGO: </w:t>
+      </w:r>
+      <w:r>
+        <w:rPr>
           <w:b w:val="0"/>
           <w:i w:val="0"/>
-          <w:color w:val="404040"/>
-          <w:sz w:val="21"/>
+          <w:sz w:val="18"/>
         </w:rPr>
-        <w:t>Cerrar aplicaciones innecesarias.</w:t>
+        <w:t>Texto a decir en voz alta. Puede adaptarse con lenguaje natural; no leer palabra-por-palabra si no es necesario.</w:t>
       </w:r>
     </w:p>
     <w:p>
       <w:pPr>
         <w:pStyle w:val="ListBullet"/>
-        <w:ind w:left="432"/>
       </w:pPr>
       <w:r>
         <w:rPr>
-          <w:rFonts w:ascii="Calibri" w:hAnsi="Calibri"/>
+          <w:b/>
+          <w:i w:val="0"/>
+          <w:sz w:val="18"/>
+        </w:rPr>
+        <w:t xml:space="preserve">Columna ACCIÓN EN PANTALLA: </w:t>
+      </w:r>
+      <w:r>
+        <w:rPr>
           <w:b w:val="0"/>
           <w:i w:val="0"/>
-          <w:color w:val="404040"/>
-          <w:sz w:val="21"/>
+          <w:sz w:val="18"/>
         </w:rPr>
-        <w:t>Tener a mano el PDF 2_GeoMIP.pdf abierto en otro monitor o ventana (para referencias).</w:t>
+        <w:t>Lo que debe verse en el proyector/pantalla en ese momento, con la ruta exacta del archivo o el comando a ejecutar.</w:t>
       </w:r>
     </w:p>
     <w:p>
       <w:pPr>
         <w:pStyle w:val="ListBullet"/>
-        <w:ind w:left="432"/>
       </w:pPr>
       <w:r>
         <w:rPr>
-          <w:rFonts w:ascii="Calibri" w:hAnsi="Calibri"/>
+          <w:b/>
+          <w:i w:val="0"/>
+          <w:sz w:val="18"/>
+        </w:rPr>
+        <w:t xml:space="preserve">Transiciones: </w:t>
+      </w:r>
+      <w:r>
+        <w:rPr>
           <w:b w:val="0"/>
           <w:i w:val="0"/>
-          <w:color w:val="404040"/>
-          <w:sz w:val="21"/>
+          <w:sz w:val="18"/>
         </w:rPr>
-        <w:t>Ejecutar python3 verificar_todo.py una vez antes de grabar para asegurarse de que todo pasa.</w:t>
+        <w:t>Los bloques sombreados en azul claro indican el inicio de una nueva sección obligatoria del video.</w:t>
       </w:r>
     </w:p>
+    <w:p/>
+    <w:p>
+      <w:r>
+        <w:rPr>
+          <w:b/>
+          <w:i w:val="0"/>
+          <w:color w:val="1F497D"/>
+          <w:sz w:val="26"/>
+        </w:rPr>
+        <w:t>GUION COMPLETO</w:t>
+      </w:r>
+    </w:p>
+    <w:tbl>
+      <w:tblPr>
+        <w:tblStyle w:val="TableGrid"/>
+        <w:tblW w:type="auto" w:w="0"/>
+        <w:jc w:val="center"/>
+        <w:tblLook w:firstColumn="1" w:firstRow="1" w:lastColumn="0" w:lastRow="0" w:noHBand="0" w:noVBand="1" w:val="04A0"/>
+      </w:tblPr>
+      <w:tblGrid>
+        <w:gridCol w:w="2340"/>
+        <w:gridCol w:w="2340"/>
+        <w:gridCol w:w="2340"/>
+        <w:gridCol w:w="2340"/>
+      </w:tblGrid>
+      <w:tr>
+        <w:tc>
+          <w:tcPr>
+            <w:tcW w:w="793" w:type="dxa"/>
+            <w:shd w:val="clear" w:color="auto" w:fill="1F497D"/>
+            <w:tcBorders>
+              <w:top w:val="single" w:sz="4" w:space="0" w:color="FFFFFF"/>
+              <w:left w:val="single" w:sz="4" w:space="0" w:color="FFFFFF"/>
+              <w:bottom w:val="single" w:sz="4" w:space="0" w:color="FFFFFF"/>
+              <w:right w:val="single" w:sz="4" w:space="0" w:color="FFFFFF"/>
+            </w:tcBorders>
+          </w:tcPr>
+          <w:p>
+            <w:pPr>
+              <w:jc w:val="center"/>
+            </w:pPr>
+            <w:r>
+              <w:rPr>
+                <w:b/>
+                <w:color w:val="FFFFFF"/>
+                <w:sz w:val="18"/>
+              </w:rPr>
+              <w:t>TIEMPO</w:t>
+            </w:r>
+          </w:p>
+        </w:tc>
+        <w:tc>
+          <w:tcPr>
+            <w:tcW w:w="1360" w:type="dxa"/>
+            <w:shd w:val="clear" w:color="auto" w:fill="1F497D"/>
+            <w:tcBorders>
+              <w:top w:val="single" w:sz="4" w:space="0" w:color="FFFFFF"/>
+              <w:left w:val="single" w:sz="4" w:space="0" w:color="FFFFFF"/>
+              <w:bottom w:val="single" w:sz="4" w:space="0" w:color="FFFFFF"/>
+              <w:right w:val="single" w:sz="4" w:space="0" w:color="FFFFFF"/>
+            </w:tcBorders>
+          </w:tcPr>
+          <w:p>
+            <w:pPr>
+              <w:jc w:val="center"/>
+            </w:pPr>
+            <w:r>
+              <w:rPr>
+                <w:b/>
+                <w:color w:val="FFFFFF"/>
+                <w:sz w:val="18"/>
+              </w:rPr>
+              <w:t>PRESENTADOR</w:t>
+            </w:r>
+          </w:p>
+        </w:tc>
+        <w:tc>
+          <w:tcPr>
+            <w:tcW w:w="4819" w:type="dxa"/>
+            <w:shd w:val="clear" w:color="auto" w:fill="1F497D"/>
+            <w:tcBorders>
+              <w:top w:val="single" w:sz="4" w:space="0" w:color="FFFFFF"/>
+              <w:left w:val="single" w:sz="4" w:space="0" w:color="FFFFFF"/>
+              <w:bottom w:val="single" w:sz="4" w:space="0" w:color="FFFFFF"/>
+              <w:right w:val="single" w:sz="4" w:space="0" w:color="FFFFFF"/>
+            </w:tcBorders>
+          </w:tcPr>
+          <w:p>
+            <w:pPr>
+              <w:jc w:val="center"/>
+            </w:pPr>
+            <w:r>
+              <w:rPr>
+                <w:b/>
+                <w:color w:val="FFFFFF"/>
+                <w:sz w:val="18"/>
+              </w:rPr>
+              <w:t>DIÁLOGO</w:t>
+            </w:r>
+          </w:p>
+        </w:tc>
+        <w:tc>
+          <w:tcPr>
+            <w:tcW w:w="3685" w:type="dxa"/>
+            <w:shd w:val="clear" w:color="auto" w:fill="1F497D"/>
+            <w:tcBorders>
+              <w:top w:val="single" w:sz="4" w:space="0" w:color="FFFFFF"/>
+              <w:left w:val="single" w:sz="4" w:space="0" w:color="FFFFFF"/>
+              <w:bottom w:val="single" w:sz="4" w:space="0" w:color="FFFFFF"/>
+              <w:right w:val="single" w:sz="4" w:space="0" w:color="FFFFFF"/>
+            </w:tcBorders>
+          </w:tcPr>
+          <w:p>
+            <w:pPr>
+              <w:jc w:val="center"/>
+            </w:pPr>
+            <w:r>
+              <w:rPr>
+                <w:b/>
+                <w:color w:val="FFFFFF"/>
+                <w:sz w:val="18"/>
+              </w:rPr>
+              <w:t>ACCIÓN EN PANTALLA</w:t>
+            </w:r>
+          </w:p>
+        </w:tc>
+      </w:tr>
+      <w:tr>
+        <w:tc>
+          <w:tcPr>
+            <w:tcW w:w="3685" w:type="dxa"/>
+            <w:gridSpan w:val="4"/>
+            <w:shd w:val="clear" w:color="auto" w:fill="C5D9F1"/>
+            <w:tcBorders>
+              <w:top w:val="single" w:sz="4" w:space="0" w:color="4472C4"/>
+              <w:left w:val="single" w:sz="4" w:space="0" w:color="4472C4"/>
+              <w:bottom w:val="single" w:sz="4" w:space="0" w:color="4472C4"/>
+              <w:right w:val="single" w:sz="4" w:space="0" w:color="4472C4"/>
+            </w:tcBorders>
+          </w:tcPr>
+          <w:p>
+            <w:pPr>
+              <w:jc w:val="center"/>
+            </w:pPr>
+            <w:r>
+              <w:rPr>
+                <w:b/>
+                <w:i w:val="0"/>
+                <w:color w:val="1F497D"/>
+                <w:sz w:val="20"/>
+              </w:rPr>
+              <w:t xml:space="preserve">◆ SECCIÓN 1: </w:t>
+            </w:r>
+            <w:r>
+              <w:rPr>
+                <w:b/>
+                <w:i w:val="0"/>
+                <w:color w:val="1F497D"/>
+                <w:sz w:val="20"/>
+              </w:rPr>
+              <w:t>INTRODUCCIÓN — ¿Por qué k-particiones?</w:t>
+            </w:r>
+            <w:r>
+              <w:rPr>
+                <w:b w:val="0"/>
+                <w:i/>
+                <w:color w:val="7F7F7F"/>
+                <w:sz w:val="18"/>
+              </w:rPr>
+              <w:t xml:space="preserve">  [Duración: 0:00 – 1:10]</w:t>
+            </w:r>
+          </w:p>
+        </w:tc>
+      </w:tr>
+      <w:tr>
+        <w:tc>
+          <w:tcPr>
+            <w:tcW w:w="793" w:type="dxa"/>
+            <w:shd w:val="clear" w:color="auto" w:fill="D6E4F0"/>
+            <w:tcBorders>
+              <w:top w:val="single" w:sz="4" w:space="0" w:color="CCCCCC"/>
+              <w:left w:val="single" w:sz="4" w:space="0" w:color="CCCCCC"/>
+              <w:bottom w:val="single" w:sz="4" w:space="0" w:color="CCCCCC"/>
+              <w:right w:val="single" w:sz="4" w:space="0" w:color="CCCCCC"/>
+            </w:tcBorders>
+          </w:tcPr>
+          <w:p>
+            <w:pPr>
+              <w:jc w:val="center"/>
+            </w:pPr>
+            <w:r>
+              <w:rPr>
+                <w:b/>
+                <w:sz w:val="18"/>
+              </w:rPr>
+              <w:t>0:00</w:t>
+            </w:r>
+          </w:p>
+        </w:tc>
+        <w:tc>
+          <w:tcPr>
+            <w:tcW w:w="1360" w:type="dxa"/>
+            <w:shd w:val="clear" w:color="auto" w:fill="D6E4F0"/>
+            <w:tcBorders>
+              <w:top w:val="single" w:sz="4" w:space="0" w:color="CCCCCC"/>
+              <w:left w:val="single" w:sz="4" w:space="0" w:color="CCCCCC"/>
+              <w:bottom w:val="single" w:sz="4" w:space="0" w:color="CCCCCC"/>
+              <w:right w:val="single" w:sz="4" w:space="0" w:color="CCCCCC"/>
+            </w:tcBorders>
+          </w:tcPr>
+          <w:p>
+            <w:pPr>
+              <w:jc w:val="center"/>
+            </w:pPr>
+            <w:r>
+              <w:rPr>
+                <w:b/>
+                <w:i w:val="0"/>
+                <w:color w:val="2E75B6"/>
+                <w:sz w:val="18"/>
+              </w:rPr>
+              <w:t>P1</w:t>
+            </w:r>
+          </w:p>
+        </w:tc>
+        <w:tc>
+          <w:tcPr>
+            <w:tcW w:w="4819" w:type="dxa"/>
+            <w:shd w:val="clear" w:color="auto" w:fill="D6E4F0"/>
+            <w:tcBorders>
+              <w:top w:val="single" w:sz="4" w:space="0" w:color="CCCCCC"/>
+              <w:left w:val="single" w:sz="4" w:space="0" w:color="CCCCCC"/>
+              <w:bottom w:val="single" w:sz="4" w:space="0" w:color="CCCCCC"/>
+              <w:right w:val="single" w:sz="4" w:space="0" w:color="CCCCCC"/>
+            </w:tcBorders>
+          </w:tcPr>
+          <w:p>
+            <w:r>
+              <w:rPr>
+                <w:b w:val="0"/>
+                <w:i w:val="0"/>
+                <w:sz w:val="18"/>
+              </w:rPr>
+              <w:t>Buenos días. Soy Mateo Mejía. En este video les presentamos K-QGMIP: una extensión a k-particiones del problema de la Mínima Partición de Información, conocido como MIP.</w:t>
+            </w:r>
+          </w:p>
+        </w:tc>
+        <w:tc>
+          <w:tcPr>
+            <w:tcW w:w="3685" w:type="dxa"/>
+            <w:shd w:val="clear" w:color="auto" w:fill="F2F2F2"/>
+            <w:tcBorders>
+              <w:top w:val="single" w:sz="4" w:space="0" w:color="CCCCCC"/>
+              <w:left w:val="single" w:sz="4" w:space="0" w:color="CCCCCC"/>
+              <w:bottom w:val="single" w:sz="4" w:space="0" w:color="CCCCCC"/>
+              <w:right w:val="single" w:sz="4" w:space="0" w:color="CCCCCC"/>
+            </w:tcBorders>
+          </w:tcPr>
+          <w:p>
+            <w:r>
+              <w:rPr>
+                <w:b w:val="0"/>
+                <w:i/>
+                <w:color w:val="7F7F7F"/>
+                <w:sz w:val="16"/>
+              </w:rPr>
+              <w:t>Pantalla: diapositiva de título o terminal con el repositorio abierto.</w:t>
+              <w:br/>
+              <w:t>Ruta: K-QGMIP_Final/</w:t>
+            </w:r>
+          </w:p>
+        </w:tc>
+      </w:tr>
+      <w:tr>
+        <w:tc>
+          <w:tcPr>
+            <w:tcW w:w="793" w:type="dxa"/>
+            <w:shd w:val="clear" w:color="auto" w:fill="E2EFDA"/>
+            <w:tcBorders>
+              <w:top w:val="single" w:sz="4" w:space="0" w:color="CCCCCC"/>
+              <w:left w:val="single" w:sz="4" w:space="0" w:color="CCCCCC"/>
+              <w:bottom w:val="single" w:sz="4" w:space="0" w:color="CCCCCC"/>
+              <w:right w:val="single" w:sz="4" w:space="0" w:color="CCCCCC"/>
+            </w:tcBorders>
+          </w:tcPr>
+          <w:p>
+            <w:pPr>
+              <w:jc w:val="center"/>
+            </w:pPr>
+            <w:r>
+              <w:rPr>
+                <w:b/>
+                <w:sz w:val="18"/>
+              </w:rPr>
+              <w:t>0:15</w:t>
+            </w:r>
+          </w:p>
+        </w:tc>
+        <w:tc>
+          <w:tcPr>
+            <w:tcW w:w="1360" w:type="dxa"/>
+            <w:shd w:val="clear" w:color="auto" w:fill="E2EFDA"/>
+            <w:tcBorders>
+              <w:top w:val="single" w:sz="4" w:space="0" w:color="CCCCCC"/>
+              <w:left w:val="single" w:sz="4" w:space="0" w:color="CCCCCC"/>
+              <w:bottom w:val="single" w:sz="4" w:space="0" w:color="CCCCCC"/>
+              <w:right w:val="single" w:sz="4" w:space="0" w:color="CCCCCC"/>
+            </w:tcBorders>
+          </w:tcPr>
+          <w:p>
+            <w:pPr>
+              <w:jc w:val="center"/>
+            </w:pPr>
+            <w:r>
+              <w:rPr>
+                <w:b/>
+                <w:i w:val="0"/>
+                <w:color w:val="378648"/>
+                <w:sz w:val="18"/>
+              </w:rPr>
+              <w:t>P2</w:t>
+            </w:r>
+          </w:p>
+        </w:tc>
+        <w:tc>
+          <w:tcPr>
+            <w:tcW w:w="4819" w:type="dxa"/>
+            <w:shd w:val="clear" w:color="auto" w:fill="E2EFDA"/>
+            <w:tcBorders>
+              <w:top w:val="single" w:sz="4" w:space="0" w:color="CCCCCC"/>
+              <w:left w:val="single" w:sz="4" w:space="0" w:color="CCCCCC"/>
+              <w:bottom w:val="single" w:sz="4" w:space="0" w:color="CCCCCC"/>
+              <w:right w:val="single" w:sz="4" w:space="0" w:color="CCCCCC"/>
+            </w:tcBorders>
+          </w:tcPr>
+          <w:p>
+            <w:r>
+              <w:rPr>
+                <w:b w:val="0"/>
+                <w:i w:val="0"/>
+                <w:sz w:val="18"/>
+              </w:rPr>
+              <w:t>Los algoritmos originales — GeoMIP y QNodes — solo evaluaban particiones binarias: dividir el sistema en exactamente dos partes. Nuestro trabajo generaliza eso a k ≥ 2 partes arbitrarias.</w:t>
+            </w:r>
+          </w:p>
+        </w:tc>
+        <w:tc>
+          <w:tcPr>
+            <w:tcW w:w="3685" w:type="dxa"/>
+            <w:shd w:val="clear" w:color="auto" w:fill="F2F2F2"/>
+            <w:tcBorders>
+              <w:top w:val="single" w:sz="4" w:space="0" w:color="CCCCCC"/>
+              <w:left w:val="single" w:sz="4" w:space="0" w:color="CCCCCC"/>
+              <w:bottom w:val="single" w:sz="4" w:space="0" w:color="CCCCCC"/>
+              <w:right w:val="single" w:sz="4" w:space="0" w:color="CCCCCC"/>
+            </w:tcBorders>
+          </w:tcPr>
+          <w:p>
+            <w:r>
+              <w:rPr>
+                <w:b w:val="0"/>
+                <w:i/>
+                <w:color w:val="7F7F7F"/>
+                <w:sz w:val="16"/>
+              </w:rPr>
+              <w:t>Pantalla: abrir README o mostrar diagrama conceptual.</w:t>
+              <w:br/>
+              <w:t>Ruta: K-QGMIP_Final/README.md</w:t>
+            </w:r>
+          </w:p>
+        </w:tc>
+      </w:tr>
+      <w:tr>
+        <w:tc>
+          <w:tcPr>
+            <w:tcW w:w="793" w:type="dxa"/>
+            <w:shd w:val="clear" w:color="auto" w:fill="D6E4F0"/>
+            <w:tcBorders>
+              <w:top w:val="single" w:sz="4" w:space="0" w:color="CCCCCC"/>
+              <w:left w:val="single" w:sz="4" w:space="0" w:color="CCCCCC"/>
+              <w:bottom w:val="single" w:sz="4" w:space="0" w:color="CCCCCC"/>
+              <w:right w:val="single" w:sz="4" w:space="0" w:color="CCCCCC"/>
+            </w:tcBorders>
+          </w:tcPr>
+          <w:p>
+            <w:pPr>
+              <w:jc w:val="center"/>
+            </w:pPr>
+            <w:r>
+              <w:rPr>
+                <w:b/>
+                <w:sz w:val="18"/>
+              </w:rPr>
+              <w:t>0:30</w:t>
+            </w:r>
+          </w:p>
+        </w:tc>
+        <w:tc>
+          <w:tcPr>
+            <w:tcW w:w="1360" w:type="dxa"/>
+            <w:shd w:val="clear" w:color="auto" w:fill="D6E4F0"/>
+            <w:tcBorders>
+              <w:top w:val="single" w:sz="4" w:space="0" w:color="CCCCCC"/>
+              <w:left w:val="single" w:sz="4" w:space="0" w:color="CCCCCC"/>
+              <w:bottom w:val="single" w:sz="4" w:space="0" w:color="CCCCCC"/>
+              <w:right w:val="single" w:sz="4" w:space="0" w:color="CCCCCC"/>
+            </w:tcBorders>
+          </w:tcPr>
+          <w:p>
+            <w:pPr>
+              <w:jc w:val="center"/>
+            </w:pPr>
+            <w:r>
+              <w:rPr>
+                <w:b/>
+                <w:i w:val="0"/>
+                <w:color w:val="2E75B6"/>
+                <w:sz w:val="18"/>
+              </w:rPr>
+              <w:t>P1</w:t>
+            </w:r>
+          </w:p>
+        </w:tc>
+        <w:tc>
+          <w:tcPr>
+            <w:tcW w:w="4819" w:type="dxa"/>
+            <w:shd w:val="clear" w:color="auto" w:fill="D6E4F0"/>
+            <w:tcBorders>
+              <w:top w:val="single" w:sz="4" w:space="0" w:color="CCCCCC"/>
+              <w:left w:val="single" w:sz="4" w:space="0" w:color="CCCCCC"/>
+              <w:bottom w:val="single" w:sz="4" w:space="0" w:color="CCCCCC"/>
+              <w:right w:val="single" w:sz="4" w:space="0" w:color="CCCCCC"/>
+            </w:tcBorders>
+          </w:tcPr>
+          <w:p>
+            <w:r>
+              <w:rPr>
+                <w:b w:val="0"/>
+                <w:i w:val="0"/>
+                <w:sz w:val="18"/>
+              </w:rPr>
+              <w:t>¿Por qué importa? La Tabla de Probabilidades de Transición — la TPM — describe cómo un sistema de n nodos evoluciona en el tiempo. Tiene 2ⁿ filas y n columnas: cada fila i es la probabilidad de que cada nodo esté ON en t+1, dado que el sistema estaba en el estado i en t.</w:t>
+            </w:r>
+          </w:p>
+        </w:tc>
+        <w:tc>
+          <w:tcPr>
+            <w:tcW w:w="3685" w:type="dxa"/>
+            <w:shd w:val="clear" w:color="auto" w:fill="F2F2F2"/>
+            <w:tcBorders>
+              <w:top w:val="single" w:sz="4" w:space="0" w:color="CCCCCC"/>
+              <w:left w:val="single" w:sz="4" w:space="0" w:color="CCCCCC"/>
+              <w:bottom w:val="single" w:sz="4" w:space="0" w:color="CCCCCC"/>
+              <w:right w:val="single" w:sz="4" w:space="0" w:color="CCCCCC"/>
+            </w:tcBorders>
+          </w:tcPr>
+          <w:p>
+            <w:r>
+              <w:rPr>
+                <w:b w:val="0"/>
+                <w:i/>
+                <w:color w:val="7F7F7F"/>
+                <w:sz w:val="16"/>
+              </w:rPr>
+              <w:t>Pantalla: abrir un CSV de ejemplo en el editor.</w:t>
+              <w:br/>
+              <w:t>Ruta: K-QGMIP_Final/QNodes/src/.samples/N3D.csv</w:t>
+              <w:br/>
+              <w:t>(3 nodos → 8 filas × 3 columnas)</w:t>
+            </w:r>
+          </w:p>
+        </w:tc>
+      </w:tr>
+      <w:tr>
+        <w:tc>
+          <w:tcPr>
+            <w:tcW w:w="793" w:type="dxa"/>
+            <w:shd w:val="clear" w:color="auto" w:fill="E2EFDA"/>
+            <w:tcBorders>
+              <w:top w:val="single" w:sz="4" w:space="0" w:color="CCCCCC"/>
+              <w:left w:val="single" w:sz="4" w:space="0" w:color="CCCCCC"/>
+              <w:bottom w:val="single" w:sz="4" w:space="0" w:color="CCCCCC"/>
+              <w:right w:val="single" w:sz="4" w:space="0" w:color="CCCCCC"/>
+            </w:tcBorders>
+          </w:tcPr>
+          <w:p>
+            <w:pPr>
+              <w:jc w:val="center"/>
+            </w:pPr>
+            <w:r>
+              <w:rPr>
+                <w:b/>
+                <w:sz w:val="18"/>
+              </w:rPr>
+              <w:t>0:50</w:t>
+            </w:r>
+          </w:p>
+        </w:tc>
+        <w:tc>
+          <w:tcPr>
+            <w:tcW w:w="1360" w:type="dxa"/>
+            <w:shd w:val="clear" w:color="auto" w:fill="E2EFDA"/>
+            <w:tcBorders>
+              <w:top w:val="single" w:sz="4" w:space="0" w:color="CCCCCC"/>
+              <w:left w:val="single" w:sz="4" w:space="0" w:color="CCCCCC"/>
+              <w:bottom w:val="single" w:sz="4" w:space="0" w:color="CCCCCC"/>
+              <w:right w:val="single" w:sz="4" w:space="0" w:color="CCCCCC"/>
+            </w:tcBorders>
+          </w:tcPr>
+          <w:p>
+            <w:pPr>
+              <w:jc w:val="center"/>
+            </w:pPr>
+            <w:r>
+              <w:rPr>
+                <w:b/>
+                <w:i w:val="0"/>
+                <w:color w:val="378648"/>
+                <w:sz w:val="18"/>
+              </w:rPr>
+              <w:t>P2</w:t>
+            </w:r>
+          </w:p>
+        </w:tc>
+        <w:tc>
+          <w:tcPr>
+            <w:tcW w:w="4819" w:type="dxa"/>
+            <w:shd w:val="clear" w:color="auto" w:fill="E2EFDA"/>
+            <w:tcBorders>
+              <w:top w:val="single" w:sz="4" w:space="0" w:color="CCCCCC"/>
+              <w:left w:val="single" w:sz="4" w:space="0" w:color="CCCCCC"/>
+              <w:bottom w:val="single" w:sz="4" w:space="0" w:color="CCCCCC"/>
+              <w:right w:val="single" w:sz="4" w:space="0" w:color="CCCCCC"/>
+            </w:tcBorders>
+          </w:tcPr>
+          <w:p>
+            <w:r>
+              <w:rPr>
+                <w:b w:val="0"/>
+                <w:i w:val="0"/>
+                <w:sz w:val="18"/>
+              </w:rPr>
+              <w:t>El módulo A — System.kpartir() — enumera particiones usando la función de Stirling S(n,k), que crece exponencialmente. Los módulos B y C son nuestras dos estrategias heurísticas para encontrar la partición que minimiza la distancia EMD.</w:t>
+            </w:r>
+          </w:p>
+        </w:tc>
+        <w:tc>
+          <w:tcPr>
+            <w:tcW w:w="3685" w:type="dxa"/>
+            <w:shd w:val="clear" w:color="auto" w:fill="F2F2F2"/>
+            <w:tcBorders>
+              <w:top w:val="single" w:sz="4" w:space="0" w:color="CCCCCC"/>
+              <w:left w:val="single" w:sz="4" w:space="0" w:color="CCCCCC"/>
+              <w:bottom w:val="single" w:sz="4" w:space="0" w:color="CCCCCC"/>
+              <w:right w:val="single" w:sz="4" w:space="0" w:color="CCCCCC"/>
+            </w:tcBorders>
+          </w:tcPr>
+          <w:p>
+            <w:r>
+              <w:rPr>
+                <w:b w:val="0"/>
+                <w:i/>
+                <w:color w:val="7F7F7F"/>
+                <w:sz w:val="16"/>
+              </w:rPr>
+              <w:t>Pantalla: mostrar estructura de carpetas.</w:t>
+              <w:br/>
+              <w:t>Ruta: K-QGMIP_Final/</w:t>
+              <w:br/>
+              <w:t xml:space="preserve">   ├── QNodes/        ← Módulo B (KQNodes Peeling Greedy)</w:t>
+              <w:br/>
+              <w:t xml:space="preserve">   ├── GeoMIP/        ← Módulo C (KGeometricSIA BFS/DP)</w:t>
+              <w:br/>
+              <w:t xml:space="preserve">   └── interfaz_kqmip.py</w:t>
+            </w:r>
+          </w:p>
+        </w:tc>
+      </w:tr>
+      <w:tr>
+        <w:tc>
+          <w:tcPr>
+            <w:tcW w:w="3685" w:type="dxa"/>
+            <w:gridSpan w:val="4"/>
+            <w:shd w:val="clear" w:color="auto" w:fill="C5D9F1"/>
+            <w:tcBorders>
+              <w:top w:val="single" w:sz="4" w:space="0" w:color="4472C4"/>
+              <w:left w:val="single" w:sz="4" w:space="0" w:color="4472C4"/>
+              <w:bottom w:val="single" w:sz="4" w:space="0" w:color="4472C4"/>
+              <w:right w:val="single" w:sz="4" w:space="0" w:color="4472C4"/>
+            </w:tcBorders>
+          </w:tcPr>
+          <w:p>
+            <w:pPr>
+              <w:jc w:val="center"/>
+            </w:pPr>
+            <w:r>
+              <w:rPr>
+                <w:b/>
+                <w:i w:val="0"/>
+                <w:color w:val="1F497D"/>
+                <w:sz w:val="20"/>
+              </w:rPr>
+              <w:t xml:space="preserve">◆ SECCIÓN 2: </w:t>
+            </w:r>
+            <w:r>
+              <w:rPr>
+                <w:b/>
+                <w:i w:val="0"/>
+                <w:color w:val="1F497D"/>
+                <w:sz w:val="20"/>
+              </w:rPr>
+              <w:t>DEMOSTRACIÓN TÉCNICA — interfaz_kqmip.py en vivo</w:t>
+            </w:r>
+            <w:r>
+              <w:rPr>
+                <w:b w:val="0"/>
+                <w:i/>
+                <w:color w:val="7F7F7F"/>
+                <w:sz w:val="18"/>
+              </w:rPr>
+              <w:t xml:space="preserve">  [Duración: 1:10 – 2:30]</w:t>
+            </w:r>
+          </w:p>
+        </w:tc>
+      </w:tr>
+      <w:tr>
+        <w:tc>
+          <w:tcPr>
+            <w:tcW w:w="793" w:type="dxa"/>
+            <w:shd w:val="clear" w:color="auto" w:fill="D6E4F0"/>
+            <w:tcBorders>
+              <w:top w:val="single" w:sz="4" w:space="0" w:color="CCCCCC"/>
+              <w:left w:val="single" w:sz="4" w:space="0" w:color="CCCCCC"/>
+              <w:bottom w:val="single" w:sz="4" w:space="0" w:color="CCCCCC"/>
+              <w:right w:val="single" w:sz="4" w:space="0" w:color="CCCCCC"/>
+            </w:tcBorders>
+          </w:tcPr>
+          <w:p>
+            <w:pPr>
+              <w:jc w:val="center"/>
+            </w:pPr>
+            <w:r>
+              <w:rPr>
+                <w:b/>
+                <w:sz w:val="18"/>
+              </w:rPr>
+              <w:t>1:10</w:t>
+            </w:r>
+          </w:p>
+        </w:tc>
+        <w:tc>
+          <w:tcPr>
+            <w:tcW w:w="1360" w:type="dxa"/>
+            <w:shd w:val="clear" w:color="auto" w:fill="D6E4F0"/>
+            <w:tcBorders>
+              <w:top w:val="single" w:sz="4" w:space="0" w:color="CCCCCC"/>
+              <w:left w:val="single" w:sz="4" w:space="0" w:color="CCCCCC"/>
+              <w:bottom w:val="single" w:sz="4" w:space="0" w:color="CCCCCC"/>
+              <w:right w:val="single" w:sz="4" w:space="0" w:color="CCCCCC"/>
+            </w:tcBorders>
+          </w:tcPr>
+          <w:p>
+            <w:pPr>
+              <w:jc w:val="center"/>
+            </w:pPr>
+            <w:r>
+              <w:rPr>
+                <w:b/>
+                <w:i w:val="0"/>
+                <w:color w:val="2E75B6"/>
+                <w:sz w:val="18"/>
+              </w:rPr>
+              <w:t>P1</w:t>
+            </w:r>
+          </w:p>
+        </w:tc>
+        <w:tc>
+          <w:tcPr>
+            <w:tcW w:w="4819" w:type="dxa"/>
+            <w:shd w:val="clear" w:color="auto" w:fill="D6E4F0"/>
+            <w:tcBorders>
+              <w:top w:val="single" w:sz="4" w:space="0" w:color="CCCCCC"/>
+              <w:left w:val="single" w:sz="4" w:space="0" w:color="CCCCCC"/>
+              <w:bottom w:val="single" w:sz="4" w:space="0" w:color="CCCCCC"/>
+              <w:right w:val="single" w:sz="4" w:space="0" w:color="CCCCCC"/>
+            </w:tcBorders>
+          </w:tcPr>
+          <w:p>
+            <w:r>
+              <w:rPr>
+                <w:b w:val="0"/>
+                <w:i w:val="0"/>
+                <w:sz w:val="18"/>
+              </w:rPr>
+              <w:t>Vamos a la demostración. Ejecutamos la interfaz unificada con el archivo N4D.csv: cuatro nodos, partición óptima conocida — dos pares independientes.</w:t>
+            </w:r>
+          </w:p>
+        </w:tc>
+        <w:tc>
+          <w:tcPr>
+            <w:tcW w:w="3685" w:type="dxa"/>
+            <w:shd w:val="clear" w:color="auto" w:fill="F2F2F2"/>
+            <w:tcBorders>
+              <w:top w:val="single" w:sz="4" w:space="0" w:color="CCCCCC"/>
+              <w:left w:val="single" w:sz="4" w:space="0" w:color="CCCCCC"/>
+              <w:bottom w:val="single" w:sz="4" w:space="0" w:color="CCCCCC"/>
+              <w:right w:val="single" w:sz="4" w:space="0" w:color="CCCCCC"/>
+            </w:tcBorders>
+          </w:tcPr>
+          <w:p>
+            <w:r>
+              <w:rPr>
+                <w:b w:val="0"/>
+                <w:i/>
+                <w:color w:val="7F7F7F"/>
+                <w:sz w:val="16"/>
+              </w:rPr>
+              <w:t>Pantalla: abrir terminal en la raíz del proyecto.</w:t>
+            </w:r>
+          </w:p>
+        </w:tc>
+      </w:tr>
+      <w:tr>
+        <w:tc>
+          <w:tcPr>
+            <w:tcW w:w="793" w:type="dxa"/>
+            <w:shd w:val="clear" w:color="auto" w:fill="D6E4F0"/>
+            <w:tcBorders>
+              <w:top w:val="single" w:sz="4" w:space="0" w:color="CCCCCC"/>
+              <w:left w:val="single" w:sz="4" w:space="0" w:color="CCCCCC"/>
+              <w:bottom w:val="single" w:sz="4" w:space="0" w:color="CCCCCC"/>
+              <w:right w:val="single" w:sz="4" w:space="0" w:color="CCCCCC"/>
+            </w:tcBorders>
+          </w:tcPr>
+          <w:p>
+            <w:pPr>
+              <w:jc w:val="center"/>
+            </w:pPr>
+            <w:r>
+              <w:rPr>
+                <w:b/>
+                <w:sz w:val="18"/>
+              </w:rPr>
+              <w:t>1:20</w:t>
+            </w:r>
+          </w:p>
+        </w:tc>
+        <w:tc>
+          <w:tcPr>
+            <w:tcW w:w="1360" w:type="dxa"/>
+            <w:shd w:val="clear" w:color="auto" w:fill="D6E4F0"/>
+            <w:tcBorders>
+              <w:top w:val="single" w:sz="4" w:space="0" w:color="CCCCCC"/>
+              <w:left w:val="single" w:sz="4" w:space="0" w:color="CCCCCC"/>
+              <w:bottom w:val="single" w:sz="4" w:space="0" w:color="CCCCCC"/>
+              <w:right w:val="single" w:sz="4" w:space="0" w:color="CCCCCC"/>
+            </w:tcBorders>
+          </w:tcPr>
+          <w:p>
+            <w:pPr>
+              <w:jc w:val="center"/>
+            </w:pPr>
+            <w:r>
+              <w:rPr>
+                <w:b/>
+                <w:i w:val="0"/>
+                <w:color w:val="2E75B6"/>
+                <w:sz w:val="18"/>
+              </w:rPr>
+              <w:t>P1</w:t>
+            </w:r>
+          </w:p>
+        </w:tc>
+        <w:tc>
+          <w:tcPr>
+            <w:tcW w:w="4819" w:type="dxa"/>
+            <w:shd w:val="clear" w:color="auto" w:fill="D6E4F0"/>
+            <w:tcBorders>
+              <w:top w:val="single" w:sz="4" w:space="0" w:color="CCCCCC"/>
+              <w:left w:val="single" w:sz="4" w:space="0" w:color="CCCCCC"/>
+              <w:bottom w:val="single" w:sz="4" w:space="0" w:color="CCCCCC"/>
+              <w:right w:val="single" w:sz="4" w:space="0" w:color="CCCCCC"/>
+            </w:tcBorders>
+          </w:tcPr>
+          <w:p>
+            <w:r>
+              <w:rPr>
+                <w:b w:val="0"/>
+                <w:i w:val="0"/>
+                <w:sz w:val="18"/>
+              </w:rPr>
+              <w:t>Escribimos: python interfaz_kqmip.py   (El presentador ejecuta el comando en vivo)</w:t>
+            </w:r>
+          </w:p>
+        </w:tc>
+        <w:tc>
+          <w:tcPr>
+            <w:tcW w:w="3685" w:type="dxa"/>
+            <w:shd w:val="clear" w:color="auto" w:fill="F2F2F2"/>
+            <w:tcBorders>
+              <w:top w:val="single" w:sz="4" w:space="0" w:color="CCCCCC"/>
+              <w:left w:val="single" w:sz="4" w:space="0" w:color="CCCCCC"/>
+              <w:bottom w:val="single" w:sz="4" w:space="0" w:color="CCCCCC"/>
+              <w:right w:val="single" w:sz="4" w:space="0" w:color="CCCCCC"/>
+            </w:tcBorders>
+          </w:tcPr>
+          <w:p>
+            <w:r>
+              <w:rPr>
+                <w:b w:val="0"/>
+                <w:i/>
+                <w:color w:val="7F7F7F"/>
+                <w:sz w:val="16"/>
+              </w:rPr>
+              <w:t>EJECUTAR en terminal:</w:t>
+              <w:br/>
+              <w:t xml:space="preserve">  cd K-QGMIP_Final</w:t>
+              <w:br/>
+              <w:t xml:space="preserve">  python interfaz_kqmip.py</w:t>
+              <w:br/>
+              <w:t>Cuando pida el archivo → ingresar:</w:t>
+              <w:br/>
+              <w:t xml:space="preserve">  QNodes/src/.samples/N4D.csv</w:t>
+              <w:br/>
+              <w:t>Cuando pida k → ingresar: 2</w:t>
+            </w:r>
+          </w:p>
+        </w:tc>
+      </w:tr>
+      <w:tr>
+        <w:tc>
+          <w:tcPr>
+            <w:tcW w:w="793" w:type="dxa"/>
+            <w:shd w:val="clear" w:color="auto" w:fill="E2EFDA"/>
+            <w:tcBorders>
+              <w:top w:val="single" w:sz="4" w:space="0" w:color="CCCCCC"/>
+              <w:left w:val="single" w:sz="4" w:space="0" w:color="CCCCCC"/>
+              <w:bottom w:val="single" w:sz="4" w:space="0" w:color="CCCCCC"/>
+              <w:right w:val="single" w:sz="4" w:space="0" w:color="CCCCCC"/>
+            </w:tcBorders>
+          </w:tcPr>
+          <w:p>
+            <w:pPr>
+              <w:jc w:val="center"/>
+            </w:pPr>
+            <w:r>
+              <w:rPr>
+                <w:b/>
+                <w:sz w:val="18"/>
+              </w:rPr>
+              <w:t>1:40</w:t>
+            </w:r>
+          </w:p>
+        </w:tc>
+        <w:tc>
+          <w:tcPr>
+            <w:tcW w:w="1360" w:type="dxa"/>
+            <w:shd w:val="clear" w:color="auto" w:fill="E2EFDA"/>
+            <w:tcBorders>
+              <w:top w:val="single" w:sz="4" w:space="0" w:color="CCCCCC"/>
+              <w:left w:val="single" w:sz="4" w:space="0" w:color="CCCCCC"/>
+              <w:bottom w:val="single" w:sz="4" w:space="0" w:color="CCCCCC"/>
+              <w:right w:val="single" w:sz="4" w:space="0" w:color="CCCCCC"/>
+            </w:tcBorders>
+          </w:tcPr>
+          <w:p>
+            <w:pPr>
+              <w:jc w:val="center"/>
+            </w:pPr>
+            <w:r>
+              <w:rPr>
+                <w:b/>
+                <w:i w:val="0"/>
+                <w:color w:val="378648"/>
+                <w:sz w:val="18"/>
+              </w:rPr>
+              <w:t>P2</w:t>
+            </w:r>
+          </w:p>
+        </w:tc>
+        <w:tc>
+          <w:tcPr>
+            <w:tcW w:w="4819" w:type="dxa"/>
+            <w:shd w:val="clear" w:color="auto" w:fill="E2EFDA"/>
+            <w:tcBorders>
+              <w:top w:val="single" w:sz="4" w:space="0" w:color="CCCCCC"/>
+              <w:left w:val="single" w:sz="4" w:space="0" w:color="CCCCCC"/>
+              <w:bottom w:val="single" w:sz="4" w:space="0" w:color="CCCCCC"/>
+              <w:right w:val="single" w:sz="4" w:space="0" w:color="CCCCCC"/>
+            </w:tcBorders>
+          </w:tcPr>
+          <w:p>
+            <w:r>
+              <w:rPr>
+                <w:b w:val="0"/>
+                <w:i w:val="0"/>
+                <w:sz w:val="18"/>
+              </w:rPr>
+              <w:t>Mientras carga, explico lo que está ocurriendo internamente: el módulo B — KQNodes Peeling Greedy — calcula la marginalización de cada nodo, es decir, integra sobre los estados posibles del resto del sistema para aislar la distribución de ese nodo. Luego usa EMD para medir cuánta información se pierde al 'cortar' una conexión.</w:t>
+            </w:r>
+          </w:p>
+        </w:tc>
+        <w:tc>
+          <w:tcPr>
+            <w:tcW w:w="3685" w:type="dxa"/>
+            <w:shd w:val="clear" w:color="auto" w:fill="F2F2F2"/>
+            <w:tcBorders>
+              <w:top w:val="single" w:sz="4" w:space="0" w:color="CCCCCC"/>
+              <w:left w:val="single" w:sz="4" w:space="0" w:color="CCCCCC"/>
+              <w:bottom w:val="single" w:sz="4" w:space="0" w:color="CCCCCC"/>
+              <w:right w:val="single" w:sz="4" w:space="0" w:color="CCCCCC"/>
+            </w:tcBorders>
+          </w:tcPr>
+          <w:p>
+            <w:r>
+              <w:rPr>
+                <w:b w:val="0"/>
+                <w:i/>
+                <w:color w:val="7F7F7F"/>
+                <w:sz w:val="16"/>
+              </w:rPr>
+              <w:t>Pantalla: salida del terminal mostrando las fases.</w:t>
+              <w:br/>
+              <w:t>FASE|4|...|KQNodes iniciando</w:t>
+              <w:br/>
+              <w:t>PASO|Marginalizando nodo 0...</w:t>
+            </w:r>
+          </w:p>
+        </w:tc>
+      </w:tr>
+      <w:tr>
+        <w:tc>
+          <w:tcPr>
+            <w:tcW w:w="793" w:type="dxa"/>
+            <w:shd w:val="clear" w:color="auto" w:fill="D6E4F0"/>
+            <w:tcBorders>
+              <w:top w:val="single" w:sz="4" w:space="0" w:color="CCCCCC"/>
+              <w:left w:val="single" w:sz="4" w:space="0" w:color="CCCCCC"/>
+              <w:bottom w:val="single" w:sz="4" w:space="0" w:color="CCCCCC"/>
+              <w:right w:val="single" w:sz="4" w:space="0" w:color="CCCCCC"/>
+            </w:tcBorders>
+          </w:tcPr>
+          <w:p>
+            <w:pPr>
+              <w:jc w:val="center"/>
+            </w:pPr>
+            <w:r>
+              <w:rPr>
+                <w:b/>
+                <w:sz w:val="18"/>
+              </w:rPr>
+              <w:t>2:05</w:t>
+            </w:r>
+          </w:p>
+        </w:tc>
+        <w:tc>
+          <w:tcPr>
+            <w:tcW w:w="1360" w:type="dxa"/>
+            <w:shd w:val="clear" w:color="auto" w:fill="D6E4F0"/>
+            <w:tcBorders>
+              <w:top w:val="single" w:sz="4" w:space="0" w:color="CCCCCC"/>
+              <w:left w:val="single" w:sz="4" w:space="0" w:color="CCCCCC"/>
+              <w:bottom w:val="single" w:sz="4" w:space="0" w:color="CCCCCC"/>
+              <w:right w:val="single" w:sz="4" w:space="0" w:color="CCCCCC"/>
+            </w:tcBorders>
+          </w:tcPr>
+          <w:p>
+            <w:pPr>
+              <w:jc w:val="center"/>
+            </w:pPr>
+            <w:r>
+              <w:rPr>
+                <w:b/>
+                <w:i w:val="0"/>
+                <w:color w:val="2E75B6"/>
+                <w:sz w:val="18"/>
+              </w:rPr>
+              <w:t>P1</w:t>
+            </w:r>
+          </w:p>
+        </w:tc>
+        <w:tc>
+          <w:tcPr>
+            <w:tcW w:w="4819" w:type="dxa"/>
+            <w:shd w:val="clear" w:color="auto" w:fill="D6E4F0"/>
+            <w:tcBorders>
+              <w:top w:val="single" w:sz="4" w:space="0" w:color="CCCCCC"/>
+              <w:left w:val="single" w:sz="4" w:space="0" w:color="CCCCCC"/>
+              <w:bottom w:val="single" w:sz="4" w:space="0" w:color="CCCCCC"/>
+              <w:right w:val="single" w:sz="4" w:space="0" w:color="CCCCCC"/>
+            </w:tcBorders>
+          </w:tcPr>
+          <w:p>
+            <w:r>
+              <w:rPr>
+                <w:b w:val="0"/>
+                <w:i w:val="0"/>
+                <w:sz w:val="18"/>
+              </w:rPr>
+              <w:t>El resultado aparece: la partición óptima para k=2 es { {0,1}, {2,3} } con EMD ≈ 0. Esto es exactamente lo esperado, porque N4D.csv fue diseñado con dos ciclos independientes. El EMD igual a cero significa integración nula entre las partes.</w:t>
+            </w:r>
+          </w:p>
+        </w:tc>
+        <w:tc>
+          <w:tcPr>
+            <w:tcW w:w="3685" w:type="dxa"/>
+            <w:shd w:val="clear" w:color="auto" w:fill="F2F2F2"/>
+            <w:tcBorders>
+              <w:top w:val="single" w:sz="4" w:space="0" w:color="CCCCCC"/>
+              <w:left w:val="single" w:sz="4" w:space="0" w:color="CCCCCC"/>
+              <w:bottom w:val="single" w:sz="4" w:space="0" w:color="CCCCCC"/>
+              <w:right w:val="single" w:sz="4" w:space="0" w:color="CCCCCC"/>
+            </w:tcBorders>
+          </w:tcPr>
+          <w:p>
+            <w:r>
+              <w:rPr>
+                <w:b w:val="0"/>
+                <w:i/>
+                <w:color w:val="7F7F7F"/>
+                <w:sz w:val="16"/>
+              </w:rPr>
+              <w:t>Pantalla: resultado en terminal.</w:t>
+              <w:br/>
+              <w:t>RESULTADO|{"particion": [[0,1],[2,3]], "emd": 0.0, "estrategia": "KQNodes"}</w:t>
+            </w:r>
+          </w:p>
+        </w:tc>
+      </w:tr>
+      <w:tr>
+        <w:tc>
+          <w:tcPr>
+            <w:tcW w:w="3685" w:type="dxa"/>
+            <w:gridSpan w:val="4"/>
+            <w:shd w:val="clear" w:color="auto" w:fill="C5D9F1"/>
+            <w:tcBorders>
+              <w:top w:val="single" w:sz="4" w:space="0" w:color="4472C4"/>
+              <w:left w:val="single" w:sz="4" w:space="0" w:color="4472C4"/>
+              <w:bottom w:val="single" w:sz="4" w:space="0" w:color="4472C4"/>
+              <w:right w:val="single" w:sz="4" w:space="0" w:color="4472C4"/>
+            </w:tcBorders>
+          </w:tcPr>
+          <w:p>
+            <w:pPr>
+              <w:jc w:val="center"/>
+            </w:pPr>
+            <w:r>
+              <w:rPr>
+                <w:b/>
+                <w:i w:val="0"/>
+                <w:color w:val="1F497D"/>
+                <w:sz w:val="20"/>
+              </w:rPr>
+              <w:t xml:space="preserve">◆ SECCIÓN 3: </w:t>
+            </w:r>
+            <w:r>
+              <w:rPr>
+                <w:b/>
+                <w:i w:val="0"/>
+                <w:color w:val="1F497D"/>
+                <w:sz w:val="20"/>
+              </w:rPr>
+              <w:t>COMPARATIVA — KQNodes vs KGeometricSIA</w:t>
+            </w:r>
+            <w:r>
+              <w:rPr>
+                <w:b w:val="0"/>
+                <w:i/>
+                <w:color w:val="7F7F7F"/>
+                <w:sz w:val="18"/>
+              </w:rPr>
+              <w:t xml:space="preserve">  [Duración: 2:30 – 3:45]</w:t>
+            </w:r>
+          </w:p>
+        </w:tc>
+      </w:tr>
+      <w:tr>
+        <w:tc>
+          <w:tcPr>
+            <w:tcW w:w="793" w:type="dxa"/>
+            <w:shd w:val="clear" w:color="auto" w:fill="E2EFDA"/>
+            <w:tcBorders>
+              <w:top w:val="single" w:sz="4" w:space="0" w:color="CCCCCC"/>
+              <w:left w:val="single" w:sz="4" w:space="0" w:color="CCCCCC"/>
+              <w:bottom w:val="single" w:sz="4" w:space="0" w:color="CCCCCC"/>
+              <w:right w:val="single" w:sz="4" w:space="0" w:color="CCCCCC"/>
+            </w:tcBorders>
+          </w:tcPr>
+          <w:p>
+            <w:pPr>
+              <w:jc w:val="center"/>
+            </w:pPr>
+            <w:r>
+              <w:rPr>
+                <w:b/>
+                <w:sz w:val="18"/>
+              </w:rPr>
+              <w:t>2:30</w:t>
+            </w:r>
+          </w:p>
+        </w:tc>
+        <w:tc>
+          <w:tcPr>
+            <w:tcW w:w="1360" w:type="dxa"/>
+            <w:shd w:val="clear" w:color="auto" w:fill="E2EFDA"/>
+            <w:tcBorders>
+              <w:top w:val="single" w:sz="4" w:space="0" w:color="CCCCCC"/>
+              <w:left w:val="single" w:sz="4" w:space="0" w:color="CCCCCC"/>
+              <w:bottom w:val="single" w:sz="4" w:space="0" w:color="CCCCCC"/>
+              <w:right w:val="single" w:sz="4" w:space="0" w:color="CCCCCC"/>
+            </w:tcBorders>
+          </w:tcPr>
+          <w:p>
+            <w:pPr>
+              <w:jc w:val="center"/>
+            </w:pPr>
+            <w:r>
+              <w:rPr>
+                <w:b/>
+                <w:i w:val="0"/>
+                <w:color w:val="378648"/>
+                <w:sz w:val="18"/>
+              </w:rPr>
+              <w:t>P2</w:t>
+            </w:r>
+          </w:p>
+        </w:tc>
+        <w:tc>
+          <w:tcPr>
+            <w:tcW w:w="4819" w:type="dxa"/>
+            <w:shd w:val="clear" w:color="auto" w:fill="E2EFDA"/>
+            <w:tcBorders>
+              <w:top w:val="single" w:sz="4" w:space="0" w:color="CCCCCC"/>
+              <w:left w:val="single" w:sz="4" w:space="0" w:color="CCCCCC"/>
+              <w:bottom w:val="single" w:sz="4" w:space="0" w:color="CCCCCC"/>
+              <w:right w:val="single" w:sz="4" w:space="0" w:color="CCCCCC"/>
+            </w:tcBorders>
+          </w:tcPr>
+          <w:p>
+            <w:r>
+              <w:rPr>
+                <w:b w:val="0"/>
+                <w:i w:val="0"/>
+                <w:sz w:val="18"/>
+              </w:rPr>
+              <w:t>Ahora comparamos las dos estrategias sobre el mismo archivo N4D.csv, pero seleccionando el módulo C: KGeometricSIA con búsqueda BFS/DP.</w:t>
+            </w:r>
+          </w:p>
+        </w:tc>
+        <w:tc>
+          <w:tcPr>
+            <w:tcW w:w="3685" w:type="dxa"/>
+            <w:shd w:val="clear" w:color="auto" w:fill="F2F2F2"/>
+            <w:tcBorders>
+              <w:top w:val="single" w:sz="4" w:space="0" w:color="CCCCCC"/>
+              <w:left w:val="single" w:sz="4" w:space="0" w:color="CCCCCC"/>
+              <w:bottom w:val="single" w:sz="4" w:space="0" w:color="CCCCCC"/>
+              <w:right w:val="single" w:sz="4" w:space="0" w:color="CCCCCC"/>
+            </w:tcBorders>
+          </w:tcPr>
+          <w:p>
+            <w:r>
+              <w:rPr>
+                <w:b w:val="0"/>
+                <w:i/>
+                <w:color w:val="7F7F7F"/>
+                <w:sz w:val="16"/>
+              </w:rPr>
+              <w:t>Pantalla: volver a ejecutar interfaz_kqmip.py.</w:t>
+              <w:br/>
+              <w:t>Cuando pida estrategia → seleccionar: KGeometricSIA</w:t>
+              <w:br/>
+              <w:t>Archivo: QNodes/src/.samples/N4D.csv</w:t>
+              <w:br/>
+              <w:t>k = 2</w:t>
+            </w:r>
+          </w:p>
+        </w:tc>
+      </w:tr>
+      <w:tr>
+        <w:tc>
+          <w:tcPr>
+            <w:tcW w:w="793" w:type="dxa"/>
+            <w:shd w:val="clear" w:color="auto" w:fill="D6E4F0"/>
+            <w:tcBorders>
+              <w:top w:val="single" w:sz="4" w:space="0" w:color="CCCCCC"/>
+              <w:left w:val="single" w:sz="4" w:space="0" w:color="CCCCCC"/>
+              <w:bottom w:val="single" w:sz="4" w:space="0" w:color="CCCCCC"/>
+              <w:right w:val="single" w:sz="4" w:space="0" w:color="CCCCCC"/>
+            </w:tcBorders>
+          </w:tcPr>
+          <w:p>
+            <w:pPr>
+              <w:jc w:val="center"/>
+            </w:pPr>
+            <w:r>
+              <w:rPr>
+                <w:b/>
+                <w:sz w:val="18"/>
+              </w:rPr>
+              <w:t>2:50</w:t>
+            </w:r>
+          </w:p>
+        </w:tc>
+        <w:tc>
+          <w:tcPr>
+            <w:tcW w:w="1360" w:type="dxa"/>
+            <w:shd w:val="clear" w:color="auto" w:fill="D6E4F0"/>
+            <w:tcBorders>
+              <w:top w:val="single" w:sz="4" w:space="0" w:color="CCCCCC"/>
+              <w:left w:val="single" w:sz="4" w:space="0" w:color="CCCCCC"/>
+              <w:bottom w:val="single" w:sz="4" w:space="0" w:color="CCCCCC"/>
+              <w:right w:val="single" w:sz="4" w:space="0" w:color="CCCCCC"/>
+            </w:tcBorders>
+          </w:tcPr>
+          <w:p>
+            <w:pPr>
+              <w:jc w:val="center"/>
+            </w:pPr>
+            <w:r>
+              <w:rPr>
+                <w:b/>
+                <w:i w:val="0"/>
+                <w:color w:val="2E75B6"/>
+                <w:sz w:val="18"/>
+              </w:rPr>
+              <w:t>P1</w:t>
+            </w:r>
+          </w:p>
+        </w:tc>
+        <w:tc>
+          <w:tcPr>
+            <w:tcW w:w="4819" w:type="dxa"/>
+            <w:shd w:val="clear" w:color="auto" w:fill="D6E4F0"/>
+            <w:tcBorders>
+              <w:top w:val="single" w:sz="4" w:space="0" w:color="CCCCCC"/>
+              <w:left w:val="single" w:sz="4" w:space="0" w:color="CCCCCC"/>
+              <w:bottom w:val="single" w:sz="4" w:space="0" w:color="CCCCCC"/>
+              <w:right w:val="single" w:sz="4" w:space="0" w:color="CCCCCC"/>
+            </w:tcBorders>
+          </w:tcPr>
+          <w:p>
+            <w:r>
+              <w:rPr>
+                <w:b w:val="0"/>
+                <w:i w:val="0"/>
+                <w:sz w:val="18"/>
+              </w:rPr>
+              <w:t>KGeometricSIA trabaja de manera diferente: modela las particiones como regiones geométricas en el espacio de estados, y usa programación dinámica para explorar las combinaciones más prometedoras. Es más lento pero más exhaustivo que el greedy de KQNodes.</w:t>
+            </w:r>
+          </w:p>
+        </w:tc>
+        <w:tc>
+          <w:tcPr>
+            <w:tcW w:w="3685" w:type="dxa"/>
+            <w:shd w:val="clear" w:color="auto" w:fill="F2F2F2"/>
+            <w:tcBorders>
+              <w:top w:val="single" w:sz="4" w:space="0" w:color="CCCCCC"/>
+              <w:left w:val="single" w:sz="4" w:space="0" w:color="CCCCCC"/>
+              <w:bottom w:val="single" w:sz="4" w:space="0" w:color="CCCCCC"/>
+              <w:right w:val="single" w:sz="4" w:space="0" w:color="CCCCCC"/>
+            </w:tcBorders>
+          </w:tcPr>
+          <w:p>
+            <w:r>
+              <w:rPr>
+                <w:b w:val="0"/>
+                <w:i/>
+                <w:color w:val="7F7F7F"/>
+                <w:sz w:val="16"/>
+              </w:rPr>
+              <w:t>Pantalla: salida del terminal con KGeometricSIA.</w:t>
+              <w:br/>
+              <w:t>FASE|4|...|KGeometricSIA BFS iniciando</w:t>
+            </w:r>
+          </w:p>
+        </w:tc>
+      </w:tr>
+      <w:tr>
+        <w:tc>
+          <w:tcPr>
+            <w:tcW w:w="793" w:type="dxa"/>
+            <w:shd w:val="clear" w:color="auto" w:fill="E2EFDA"/>
+            <w:tcBorders>
+              <w:top w:val="single" w:sz="4" w:space="0" w:color="CCCCCC"/>
+              <w:left w:val="single" w:sz="4" w:space="0" w:color="CCCCCC"/>
+              <w:bottom w:val="single" w:sz="4" w:space="0" w:color="CCCCCC"/>
+              <w:right w:val="single" w:sz="4" w:space="0" w:color="CCCCCC"/>
+            </w:tcBorders>
+          </w:tcPr>
+          <w:p>
+            <w:pPr>
+              <w:jc w:val="center"/>
+            </w:pPr>
+            <w:r>
+              <w:rPr>
+                <w:b/>
+                <w:sz w:val="18"/>
+              </w:rPr>
+              <w:t>3:10</w:t>
+            </w:r>
+          </w:p>
+        </w:tc>
+        <w:tc>
+          <w:tcPr>
+            <w:tcW w:w="1360" w:type="dxa"/>
+            <w:shd w:val="clear" w:color="auto" w:fill="E2EFDA"/>
+            <w:tcBorders>
+              <w:top w:val="single" w:sz="4" w:space="0" w:color="CCCCCC"/>
+              <w:left w:val="single" w:sz="4" w:space="0" w:color="CCCCCC"/>
+              <w:bottom w:val="single" w:sz="4" w:space="0" w:color="CCCCCC"/>
+              <w:right w:val="single" w:sz="4" w:space="0" w:color="CCCCCC"/>
+            </w:tcBorders>
+          </w:tcPr>
+          <w:p>
+            <w:pPr>
+              <w:jc w:val="center"/>
+            </w:pPr>
+            <w:r>
+              <w:rPr>
+                <w:b/>
+                <w:i w:val="0"/>
+                <w:color w:val="378648"/>
+                <w:sz w:val="18"/>
+              </w:rPr>
+              <w:t>P2</w:t>
+            </w:r>
+          </w:p>
+        </w:tc>
+        <w:tc>
+          <w:tcPr>
+            <w:tcW w:w="4819" w:type="dxa"/>
+            <w:shd w:val="clear" w:color="auto" w:fill="E2EFDA"/>
+            <w:tcBorders>
+              <w:top w:val="single" w:sz="4" w:space="0" w:color="CCCCCC"/>
+              <w:left w:val="single" w:sz="4" w:space="0" w:color="CCCCCC"/>
+              <w:bottom w:val="single" w:sz="4" w:space="0" w:color="CCCCCC"/>
+              <w:right w:val="single" w:sz="4" w:space="0" w:color="CCCCCC"/>
+            </w:tcBorders>
+          </w:tcPr>
+          <w:p>
+            <w:r>
+              <w:rPr>
+                <w:b w:val="0"/>
+                <w:i w:val="0"/>
+                <w:sz w:val="18"/>
+              </w:rPr>
+              <w:t>Ambos módulos obtienen la misma partición { {0,1}, {2,3} } con EMD = 0. Esto valida la consistencia de la implementación. En sistemas más complejos — como N6B con seis nodos — las dos estrategias pueden diferir en tiempo y en la partición encontrada cuando no existe una solución perfecta.</w:t>
+            </w:r>
+          </w:p>
+        </w:tc>
+        <w:tc>
+          <w:tcPr>
+            <w:tcW w:w="3685" w:type="dxa"/>
+            <w:shd w:val="clear" w:color="auto" w:fill="F2F2F2"/>
+            <w:tcBorders>
+              <w:top w:val="single" w:sz="4" w:space="0" w:color="CCCCCC"/>
+              <w:left w:val="single" w:sz="4" w:space="0" w:color="CCCCCC"/>
+              <w:bottom w:val="single" w:sz="4" w:space="0" w:color="CCCCCC"/>
+              <w:right w:val="single" w:sz="4" w:space="0" w:color="CCCCCC"/>
+            </w:tcBorders>
+          </w:tcPr>
+          <w:p>
+            <w:r>
+              <w:rPr>
+                <w:b w:val="0"/>
+                <w:i/>
+                <w:color w:val="7F7F7F"/>
+                <w:sz w:val="16"/>
+              </w:rPr>
+              <w:t>Pantalla: tabla comparativa en un bloc de notas o documento.</w:t>
+              <w:br/>
+              <w:t xml:space="preserve">  CSV     | K | KQNodes EMD | KGeomSIA EMD</w:t>
+              <w:br/>
+              <w:t xml:space="preserve">  N4D     | 2 |     0.0     |     0.0</w:t>
+              <w:br/>
+              <w:t xml:space="preserve">  N6B     | 2 |    ~0.0     |    ~0.0</w:t>
+              <w:br/>
+              <w:t xml:space="preserve">  N4F     | 2 |    &lt;0.5     |    &lt;0.5</w:t>
+              <w:br/>
+              <w:t>Rutas: K-QGMIP_Final/QNodes/src/.samples/</w:t>
+              <w:br/>
+              <w:t xml:space="preserve">       K-QGMIP_Final/GeoMIP/data/samples/</w:t>
+            </w:r>
+          </w:p>
+        </w:tc>
+      </w:tr>
+      <w:tr>
+        <w:tc>
+          <w:tcPr>
+            <w:tcW w:w="793" w:type="dxa"/>
+            <w:shd w:val="clear" w:color="auto" w:fill="D6E4F0"/>
+            <w:tcBorders>
+              <w:top w:val="single" w:sz="4" w:space="0" w:color="CCCCCC"/>
+              <w:left w:val="single" w:sz="4" w:space="0" w:color="CCCCCC"/>
+              <w:bottom w:val="single" w:sz="4" w:space="0" w:color="CCCCCC"/>
+              <w:right w:val="single" w:sz="4" w:space="0" w:color="CCCCCC"/>
+            </w:tcBorders>
+          </w:tcPr>
+          <w:p>
+            <w:pPr>
+              <w:jc w:val="center"/>
+            </w:pPr>
+            <w:r>
+              <w:rPr>
+                <w:b/>
+                <w:sz w:val="18"/>
+              </w:rPr>
+              <w:t>3:30</w:t>
+            </w:r>
+          </w:p>
+        </w:tc>
+        <w:tc>
+          <w:tcPr>
+            <w:tcW w:w="1360" w:type="dxa"/>
+            <w:shd w:val="clear" w:color="auto" w:fill="D6E4F0"/>
+            <w:tcBorders>
+              <w:top w:val="single" w:sz="4" w:space="0" w:color="CCCCCC"/>
+              <w:left w:val="single" w:sz="4" w:space="0" w:color="CCCCCC"/>
+              <w:bottom w:val="single" w:sz="4" w:space="0" w:color="CCCCCC"/>
+              <w:right w:val="single" w:sz="4" w:space="0" w:color="CCCCCC"/>
+            </w:tcBorders>
+          </w:tcPr>
+          <w:p>
+            <w:pPr>
+              <w:jc w:val="center"/>
+            </w:pPr>
+            <w:r>
+              <w:rPr>
+                <w:b/>
+                <w:i w:val="0"/>
+                <w:color w:val="2E75B6"/>
+                <w:sz w:val="18"/>
+              </w:rPr>
+              <w:t>P1</w:t>
+            </w:r>
+          </w:p>
+        </w:tc>
+        <w:tc>
+          <w:tcPr>
+            <w:tcW w:w="4819" w:type="dxa"/>
+            <w:shd w:val="clear" w:color="auto" w:fill="D6E4F0"/>
+            <w:tcBorders>
+              <w:top w:val="single" w:sz="4" w:space="0" w:color="CCCCCC"/>
+              <w:left w:val="single" w:sz="4" w:space="0" w:color="CCCCCC"/>
+              <w:bottom w:val="single" w:sz="4" w:space="0" w:color="CCCCCC"/>
+              <w:right w:val="single" w:sz="4" w:space="0" w:color="CCCCCC"/>
+            </w:tcBorders>
+          </w:tcPr>
+          <w:p>
+            <w:r>
+              <w:rPr>
+                <w:b w:val="0"/>
+                <w:i w:val="0"/>
+                <w:sz w:val="18"/>
+              </w:rPr>
+              <w:t>La elección entre estrategias depende del tamaño del sistema: para n ≤ 4 KQNodes es suficiente; para n ≥ 5 KGeometricSIA puede encontrar mejores soluciones a costa de mayor tiempo de cómputo.</w:t>
+            </w:r>
+          </w:p>
+        </w:tc>
+        <w:tc>
+          <w:tcPr>
+            <w:tcW w:w="3685" w:type="dxa"/>
+            <w:shd w:val="clear" w:color="auto" w:fill="F2F2F2"/>
+            <w:tcBorders>
+              <w:top w:val="single" w:sz="4" w:space="0" w:color="CCCCCC"/>
+              <w:left w:val="single" w:sz="4" w:space="0" w:color="CCCCCC"/>
+              <w:bottom w:val="single" w:sz="4" w:space="0" w:color="CCCCCC"/>
+              <w:right w:val="single" w:sz="4" w:space="0" w:color="CCCCCC"/>
+            </w:tcBorders>
+          </w:tcPr>
+          <w:p>
+            <w:r>
+              <w:rPr>
+                <w:b w:val="0"/>
+                <w:i/>
+                <w:color w:val="7F7F7F"/>
+                <w:sz w:val="16"/>
+              </w:rPr>
+              <w:t>Pantalla: mostrar el archivo de revisión de rendimiento.</w:t>
+              <w:br/>
+              <w:t>Ruta: K-QGMIP_Final/review/profiling/</w:t>
+              <w:br/>
+              <w:t>(señalar que los HTML vacíos corresponden a sistemas rápidos &lt; 50ms;</w:t>
+              <w:br/>
+              <w:t xml:space="preserve"> los reports de GeoMIP N15A sí están llenos por su mayor complejidad)</w:t>
+            </w:r>
+          </w:p>
+        </w:tc>
+      </w:tr>
+      <w:tr>
+        <w:tc>
+          <w:tcPr>
+            <w:tcW w:w="3685" w:type="dxa"/>
+            <w:gridSpan w:val="4"/>
+            <w:shd w:val="clear" w:color="auto" w:fill="C5D9F1"/>
+            <w:tcBorders>
+              <w:top w:val="single" w:sz="4" w:space="0" w:color="4472C4"/>
+              <w:left w:val="single" w:sz="4" w:space="0" w:color="4472C4"/>
+              <w:bottom w:val="single" w:sz="4" w:space="0" w:color="4472C4"/>
+              <w:right w:val="single" w:sz="4" w:space="0" w:color="4472C4"/>
+            </w:tcBorders>
+          </w:tcPr>
+          <w:p>
+            <w:pPr>
+              <w:jc w:val="center"/>
+            </w:pPr>
+            <w:r>
+              <w:rPr>
+                <w:b/>
+                <w:i w:val="0"/>
+                <w:color w:val="1F497D"/>
+                <w:sz w:val="20"/>
+              </w:rPr>
+              <w:t xml:space="preserve">◆ SECCIÓN 4: </w:t>
+            </w:r>
+            <w:r>
+              <w:rPr>
+                <w:b/>
+                <w:i w:val="0"/>
+                <w:color w:val="1F497D"/>
+                <w:sz w:val="20"/>
+              </w:rPr>
+              <w:t>CIERRE — Pruebas, conclusiones y referencias</w:t>
+            </w:r>
+            <w:r>
+              <w:rPr>
+                <w:b w:val="0"/>
+                <w:i/>
+                <w:color w:val="7F7F7F"/>
+                <w:sz w:val="18"/>
+              </w:rPr>
+              <w:t xml:space="preserve">  [Duración: 3:45 – 5:00]</w:t>
+            </w:r>
+          </w:p>
+        </w:tc>
+      </w:tr>
+      <w:tr>
+        <w:tc>
+          <w:tcPr>
+            <w:tcW w:w="793" w:type="dxa"/>
+            <w:shd w:val="clear" w:color="auto" w:fill="E2EFDA"/>
+            <w:tcBorders>
+              <w:top w:val="single" w:sz="4" w:space="0" w:color="CCCCCC"/>
+              <w:left w:val="single" w:sz="4" w:space="0" w:color="CCCCCC"/>
+              <w:bottom w:val="single" w:sz="4" w:space="0" w:color="CCCCCC"/>
+              <w:right w:val="single" w:sz="4" w:space="0" w:color="CCCCCC"/>
+            </w:tcBorders>
+          </w:tcPr>
+          <w:p>
+            <w:pPr>
+              <w:jc w:val="center"/>
+            </w:pPr>
+            <w:r>
+              <w:rPr>
+                <w:b/>
+                <w:sz w:val="18"/>
+              </w:rPr>
+              <w:t>3:45</w:t>
+            </w:r>
+          </w:p>
+        </w:tc>
+        <w:tc>
+          <w:tcPr>
+            <w:tcW w:w="1360" w:type="dxa"/>
+            <w:shd w:val="clear" w:color="auto" w:fill="E2EFDA"/>
+            <w:tcBorders>
+              <w:top w:val="single" w:sz="4" w:space="0" w:color="CCCCCC"/>
+              <w:left w:val="single" w:sz="4" w:space="0" w:color="CCCCCC"/>
+              <w:bottom w:val="single" w:sz="4" w:space="0" w:color="CCCCCC"/>
+              <w:right w:val="single" w:sz="4" w:space="0" w:color="CCCCCC"/>
+            </w:tcBorders>
+          </w:tcPr>
+          <w:p>
+            <w:pPr>
+              <w:jc w:val="center"/>
+            </w:pPr>
+            <w:r>
+              <w:rPr>
+                <w:b/>
+                <w:i w:val="0"/>
+                <w:color w:val="378648"/>
+                <w:sz w:val="18"/>
+              </w:rPr>
+              <w:t>P2</w:t>
+            </w:r>
+          </w:p>
+        </w:tc>
+        <w:tc>
+          <w:tcPr>
+            <w:tcW w:w="4819" w:type="dxa"/>
+            <w:shd w:val="clear" w:color="auto" w:fill="E2EFDA"/>
+            <w:tcBorders>
+              <w:top w:val="single" w:sz="4" w:space="0" w:color="CCCCCC"/>
+              <w:left w:val="single" w:sz="4" w:space="0" w:color="CCCCCC"/>
+              <w:bottom w:val="single" w:sz="4" w:space="0" w:color="CCCCCC"/>
+              <w:right w:val="single" w:sz="4" w:space="0" w:color="CCCCCC"/>
+            </w:tcBorders>
+          </w:tcPr>
+          <w:p>
+            <w:r>
+              <w:rPr>
+                <w:b w:val="0"/>
+                <w:i w:val="0"/>
+                <w:sz w:val="18"/>
+              </w:rPr>
+              <w:t>Para garantizar la correctitud del proyecto, implementamos 16 pruebas unitarias que verifican cada módulo de forma independiente. Las ejecutamos ahora.</w:t>
+            </w:r>
+          </w:p>
+        </w:tc>
+        <w:tc>
+          <w:tcPr>
+            <w:tcW w:w="3685" w:type="dxa"/>
+            <w:shd w:val="clear" w:color="auto" w:fill="F2F2F2"/>
+            <w:tcBorders>
+              <w:top w:val="single" w:sz="4" w:space="0" w:color="CCCCCC"/>
+              <w:left w:val="single" w:sz="4" w:space="0" w:color="CCCCCC"/>
+              <w:bottom w:val="single" w:sz="4" w:space="0" w:color="CCCCCC"/>
+              <w:right w:val="single" w:sz="4" w:space="0" w:color="CCCCCC"/>
+            </w:tcBorders>
+          </w:tcPr>
+          <w:p>
+            <w:r>
+              <w:rPr>
+                <w:b w:val="0"/>
+                <w:i/>
+                <w:color w:val="7F7F7F"/>
+                <w:sz w:val="16"/>
+              </w:rPr>
+              <w:t>EJECUTAR en terminal:</w:t>
+              <w:br/>
+              <w:t xml:space="preserve">  cd K-QGMIP_Final</w:t>
+              <w:br/>
+              <w:t xml:space="preserve">  python verificar_todo.py</w:t>
+              <w:br/>
+              <w:t>Esperar salida: 16 tests — PASSED</w:t>
+            </w:r>
+          </w:p>
+        </w:tc>
+      </w:tr>
+      <w:tr>
+        <w:tc>
+          <w:tcPr>
+            <w:tcW w:w="793" w:type="dxa"/>
+            <w:shd w:val="clear" w:color="auto" w:fill="D6E4F0"/>
+            <w:tcBorders>
+              <w:top w:val="single" w:sz="4" w:space="0" w:color="CCCCCC"/>
+              <w:left w:val="single" w:sz="4" w:space="0" w:color="CCCCCC"/>
+              <w:bottom w:val="single" w:sz="4" w:space="0" w:color="CCCCCC"/>
+              <w:right w:val="single" w:sz="4" w:space="0" w:color="CCCCCC"/>
+            </w:tcBorders>
+          </w:tcPr>
+          <w:p>
+            <w:pPr>
+              <w:jc w:val="center"/>
+            </w:pPr>
+            <w:r>
+              <w:rPr>
+                <w:b/>
+                <w:sz w:val="18"/>
+              </w:rPr>
+              <w:t>4:00</w:t>
+            </w:r>
+          </w:p>
+        </w:tc>
+        <w:tc>
+          <w:tcPr>
+            <w:tcW w:w="1360" w:type="dxa"/>
+            <w:shd w:val="clear" w:color="auto" w:fill="D6E4F0"/>
+            <w:tcBorders>
+              <w:top w:val="single" w:sz="4" w:space="0" w:color="CCCCCC"/>
+              <w:left w:val="single" w:sz="4" w:space="0" w:color="CCCCCC"/>
+              <w:bottom w:val="single" w:sz="4" w:space="0" w:color="CCCCCC"/>
+              <w:right w:val="single" w:sz="4" w:space="0" w:color="CCCCCC"/>
+            </w:tcBorders>
+          </w:tcPr>
+          <w:p>
+            <w:pPr>
+              <w:jc w:val="center"/>
+            </w:pPr>
+            <w:r>
+              <w:rPr>
+                <w:b/>
+                <w:i w:val="0"/>
+                <w:color w:val="2E75B6"/>
+                <w:sz w:val="18"/>
+              </w:rPr>
+              <w:t>P1</w:t>
+            </w:r>
+          </w:p>
+        </w:tc>
+        <w:tc>
+          <w:tcPr>
+            <w:tcW w:w="4819" w:type="dxa"/>
+            <w:shd w:val="clear" w:color="auto" w:fill="D6E4F0"/>
+            <w:tcBorders>
+              <w:top w:val="single" w:sz="4" w:space="0" w:color="CCCCCC"/>
+              <w:left w:val="single" w:sz="4" w:space="0" w:color="CCCCCC"/>
+              <w:bottom w:val="single" w:sz="4" w:space="0" w:color="CCCCCC"/>
+              <w:right w:val="single" w:sz="4" w:space="0" w:color="CCCCCC"/>
+            </w:tcBorders>
+          </w:tcPr>
+          <w:p>
+            <w:r>
+              <w:rPr>
+                <w:b w:val="0"/>
+                <w:i w:val="0"/>
+                <w:sz w:val="18"/>
+              </w:rPr>
+              <w:t>Todas las pruebas pasan. Esto incluye: validación del formato de la TPM, corrección del cálculo de EMD, verificación de que las k-particiones sean mutuamente excluyentes y colectivamente exhaustivas, y pruebas de integración del flujo completo.</w:t>
+            </w:r>
+          </w:p>
+        </w:tc>
+        <w:tc>
+          <w:tcPr>
+            <w:tcW w:w="3685" w:type="dxa"/>
+            <w:shd w:val="clear" w:color="auto" w:fill="F2F2F2"/>
+            <w:tcBorders>
+              <w:top w:val="single" w:sz="4" w:space="0" w:color="CCCCCC"/>
+              <w:left w:val="single" w:sz="4" w:space="0" w:color="CCCCCC"/>
+              <w:bottom w:val="single" w:sz="4" w:space="0" w:color="CCCCCC"/>
+              <w:right w:val="single" w:sz="4" w:space="0" w:color="CCCCCC"/>
+            </w:tcBorders>
+          </w:tcPr>
+          <w:p>
+            <w:r>
+              <w:rPr>
+                <w:b w:val="0"/>
+                <w:i/>
+                <w:color w:val="7F7F7F"/>
+                <w:sz w:val="16"/>
+              </w:rPr>
+              <w:t>Pantalla: salida de verificar_todo.py con todos los tests en verde.</w:t>
+              <w:br/>
+              <w:t>Ruta: K-QGMIP_Final/verificar_todo.py</w:t>
+            </w:r>
+          </w:p>
+        </w:tc>
+      </w:tr>
+      <w:tr>
+        <w:tc>
+          <w:tcPr>
+            <w:tcW w:w="793" w:type="dxa"/>
+            <w:shd w:val="clear" w:color="auto" w:fill="E2EFDA"/>
+            <w:tcBorders>
+              <w:top w:val="single" w:sz="4" w:space="0" w:color="CCCCCC"/>
+              <w:left w:val="single" w:sz="4" w:space="0" w:color="CCCCCC"/>
+              <w:bottom w:val="single" w:sz="4" w:space="0" w:color="CCCCCC"/>
+              <w:right w:val="single" w:sz="4" w:space="0" w:color="CCCCCC"/>
+            </w:tcBorders>
+          </w:tcPr>
+          <w:p>
+            <w:pPr>
+              <w:jc w:val="center"/>
+            </w:pPr>
+            <w:r>
+              <w:rPr>
+                <w:b/>
+                <w:sz w:val="18"/>
+              </w:rPr>
+              <w:t>4:20</w:t>
+            </w:r>
+          </w:p>
+        </w:tc>
+        <w:tc>
+          <w:tcPr>
+            <w:tcW w:w="1360" w:type="dxa"/>
+            <w:shd w:val="clear" w:color="auto" w:fill="E2EFDA"/>
+            <w:tcBorders>
+              <w:top w:val="single" w:sz="4" w:space="0" w:color="CCCCCC"/>
+              <w:left w:val="single" w:sz="4" w:space="0" w:color="CCCCCC"/>
+              <w:bottom w:val="single" w:sz="4" w:space="0" w:color="CCCCCC"/>
+              <w:right w:val="single" w:sz="4" w:space="0" w:color="CCCCCC"/>
+            </w:tcBorders>
+          </w:tcPr>
+          <w:p>
+            <w:pPr>
+              <w:jc w:val="center"/>
+            </w:pPr>
+            <w:r>
+              <w:rPr>
+                <w:b/>
+                <w:i w:val="0"/>
+                <w:color w:val="378648"/>
+                <w:sz w:val="18"/>
+              </w:rPr>
+              <w:t>P2</w:t>
+            </w:r>
+          </w:p>
+        </w:tc>
+        <w:tc>
+          <w:tcPr>
+            <w:tcW w:w="4819" w:type="dxa"/>
+            <w:shd w:val="clear" w:color="auto" w:fill="E2EFDA"/>
+            <w:tcBorders>
+              <w:top w:val="single" w:sz="4" w:space="0" w:color="CCCCCC"/>
+              <w:left w:val="single" w:sz="4" w:space="0" w:color="CCCCCC"/>
+              <w:bottom w:val="single" w:sz="4" w:space="0" w:color="CCCCCC"/>
+              <w:right w:val="single" w:sz="4" w:space="0" w:color="CCCCCC"/>
+            </w:tcBorders>
+          </w:tcPr>
+          <w:p>
+            <w:r>
+              <w:rPr>
+                <w:b w:val="0"/>
+                <w:i w:val="0"/>
+                <w:sz w:val="18"/>
+              </w:rPr>
+              <w:t>A modo de conclusión: generalizamos GeoMIP y QNodes a k particiones arbitrarias, implementamos dos estrategias heurísticas con complejidades distintas, y provemos una interfaz unificada que permite al usuario seleccionar la estrategia y el número de particiones interactivamente.</w:t>
+            </w:r>
+          </w:p>
+        </w:tc>
+        <w:tc>
+          <w:tcPr>
+            <w:tcW w:w="3685" w:type="dxa"/>
+            <w:shd w:val="clear" w:color="auto" w:fill="F2F2F2"/>
+            <w:tcBorders>
+              <w:top w:val="single" w:sz="4" w:space="0" w:color="CCCCCC"/>
+              <w:left w:val="single" w:sz="4" w:space="0" w:color="CCCCCC"/>
+              <w:bottom w:val="single" w:sz="4" w:space="0" w:color="CCCCCC"/>
+              <w:right w:val="single" w:sz="4" w:space="0" w:color="CCCCCC"/>
+            </w:tcBorders>
+          </w:tcPr>
+          <w:p>
+            <w:r>
+              <w:rPr>
+                <w:b w:val="0"/>
+                <w:i/>
+                <w:color w:val="7F7F7F"/>
+                <w:sz w:val="16"/>
+              </w:rPr>
+              <w:t>Pantalla: abrir Manual Técnico.</w:t>
+              <w:br/>
+              <w:t>Ruta: K-QGMIP_Final/docs/doc_biblioteca/docFinal/Manual_Tecnico_KQMIP.docx</w:t>
+            </w:r>
+          </w:p>
+        </w:tc>
+      </w:tr>
+      <w:tr>
+        <w:tc>
+          <w:tcPr>
+            <w:tcW w:w="793" w:type="dxa"/>
+            <w:shd w:val="clear" w:color="auto" w:fill="D6E4F0"/>
+            <w:tcBorders>
+              <w:top w:val="single" w:sz="4" w:space="0" w:color="CCCCCC"/>
+              <w:left w:val="single" w:sz="4" w:space="0" w:color="CCCCCC"/>
+              <w:bottom w:val="single" w:sz="4" w:space="0" w:color="CCCCCC"/>
+              <w:right w:val="single" w:sz="4" w:space="0" w:color="CCCCCC"/>
+            </w:tcBorders>
+          </w:tcPr>
+          <w:p>
+            <w:pPr>
+              <w:jc w:val="center"/>
+            </w:pPr>
+            <w:r>
+              <w:rPr>
+                <w:b/>
+                <w:sz w:val="18"/>
+              </w:rPr>
+              <w:t>4:40</w:t>
+            </w:r>
+          </w:p>
+        </w:tc>
+        <w:tc>
+          <w:tcPr>
+            <w:tcW w:w="1360" w:type="dxa"/>
+            <w:shd w:val="clear" w:color="auto" w:fill="D6E4F0"/>
+            <w:tcBorders>
+              <w:top w:val="single" w:sz="4" w:space="0" w:color="CCCCCC"/>
+              <w:left w:val="single" w:sz="4" w:space="0" w:color="CCCCCC"/>
+              <w:bottom w:val="single" w:sz="4" w:space="0" w:color="CCCCCC"/>
+              <w:right w:val="single" w:sz="4" w:space="0" w:color="CCCCCC"/>
+            </w:tcBorders>
+          </w:tcPr>
+          <w:p>
+            <w:pPr>
+              <w:jc w:val="center"/>
+            </w:pPr>
+            <w:r>
+              <w:rPr>
+                <w:b/>
+                <w:i w:val="0"/>
+                <w:color w:val="2E75B6"/>
+                <w:sz w:val="18"/>
+              </w:rPr>
+              <w:t>P1</w:t>
+            </w:r>
+          </w:p>
+        </w:tc>
+        <w:tc>
+          <w:tcPr>
+            <w:tcW w:w="4819" w:type="dxa"/>
+            <w:shd w:val="clear" w:color="auto" w:fill="D6E4F0"/>
+            <w:tcBorders>
+              <w:top w:val="single" w:sz="4" w:space="0" w:color="CCCCCC"/>
+              <w:left w:val="single" w:sz="4" w:space="0" w:color="CCCCCC"/>
+              <w:bottom w:val="single" w:sz="4" w:space="0" w:color="CCCCCC"/>
+              <w:right w:val="single" w:sz="4" w:space="0" w:color="CCCCCC"/>
+            </w:tcBorders>
+          </w:tcPr>
+          <w:p>
+            <w:r>
+              <w:rPr>
+                <w:b w:val="0"/>
+                <w:i w:val="0"/>
+                <w:sz w:val="18"/>
+              </w:rPr>
+              <w:t>La documentación completa — incluyendo el Manual Técnico y el Manual de Usuario — está disponible en la carpeta docs/. El repositorio del proyecto y las referencias bibliográficas se encuentran en el archivo README.</w:t>
+            </w:r>
+          </w:p>
+        </w:tc>
+        <w:tc>
+          <w:tcPr>
+            <w:tcW w:w="3685" w:type="dxa"/>
+            <w:shd w:val="clear" w:color="auto" w:fill="F2F2F2"/>
+            <w:tcBorders>
+              <w:top w:val="single" w:sz="4" w:space="0" w:color="CCCCCC"/>
+              <w:left w:val="single" w:sz="4" w:space="0" w:color="CCCCCC"/>
+              <w:bottom w:val="single" w:sz="4" w:space="0" w:color="CCCCCC"/>
+              <w:right w:val="single" w:sz="4" w:space="0" w:color="CCCCCC"/>
+            </w:tcBorders>
+          </w:tcPr>
+          <w:p>
+            <w:r>
+              <w:rPr>
+                <w:b w:val="0"/>
+                <w:i/>
+                <w:color w:val="7F7F7F"/>
+                <w:sz w:val="16"/>
+              </w:rPr>
+              <w:t>Pantalla: abrir README en el editor o mostrar el repositorio GitHub.</w:t>
+              <w:br/>
+              <w:t>Ruta: K-QGMIP_Final/README.md</w:t>
+              <w:br/>
+              <w:t>Repo: github.com/JuManoel/projecto-analisis-20261</w:t>
+            </w:r>
+          </w:p>
+        </w:tc>
+      </w:tr>
+      <w:tr>
+        <w:tc>
+          <w:tcPr>
+            <w:tcW w:w="793" w:type="dxa"/>
+            <w:shd w:val="clear" w:color="auto" w:fill="FFFFFF"/>
+            <w:tcBorders>
+              <w:top w:val="single" w:sz="4" w:space="0" w:color="CCCCCC"/>
+              <w:left w:val="single" w:sz="4" w:space="0" w:color="CCCCCC"/>
+              <w:bottom w:val="single" w:sz="4" w:space="0" w:color="CCCCCC"/>
+              <w:right w:val="single" w:sz="4" w:space="0" w:color="CCCCCC"/>
+            </w:tcBorders>
+          </w:tcPr>
+          <w:p>
+            <w:pPr>
+              <w:jc w:val="center"/>
+            </w:pPr>
+            <w:r>
+              <w:rPr>
+                <w:b/>
+                <w:sz w:val="18"/>
+              </w:rPr>
+              <w:t>4:50</w:t>
+            </w:r>
+          </w:p>
+        </w:tc>
+        <w:tc>
+          <w:tcPr>
+            <w:tcW w:w="1360" w:type="dxa"/>
+            <w:shd w:val="clear" w:color="auto" w:fill="FFFFFF"/>
+            <w:tcBorders>
+              <w:top w:val="single" w:sz="4" w:space="0" w:color="CCCCCC"/>
+              <w:left w:val="single" w:sz="4" w:space="0" w:color="CCCCCC"/>
+              <w:bottom w:val="single" w:sz="4" w:space="0" w:color="CCCCCC"/>
+              <w:right w:val="single" w:sz="4" w:space="0" w:color="CCCCCC"/>
+            </w:tcBorders>
+          </w:tcPr>
+          <w:p>
+            <w:pPr>
+              <w:jc w:val="center"/>
+            </w:pPr>
+            <w:r>
+              <w:rPr>
+                <w:b/>
+                <w:i w:val="0"/>
+                <w:color w:val="1F497D"/>
+                <w:sz w:val="18"/>
+              </w:rPr>
+              <w:t>AMBOS</w:t>
+            </w:r>
+          </w:p>
+        </w:tc>
+        <w:tc>
+          <w:tcPr>
+            <w:tcW w:w="4819" w:type="dxa"/>
+            <w:shd w:val="clear" w:color="auto" w:fill="FFFFFF"/>
+            <w:tcBorders>
+              <w:top w:val="single" w:sz="4" w:space="0" w:color="CCCCCC"/>
+              <w:left w:val="single" w:sz="4" w:space="0" w:color="CCCCCC"/>
+              <w:bottom w:val="single" w:sz="4" w:space="0" w:color="CCCCCC"/>
+              <w:right w:val="single" w:sz="4" w:space="0" w:color="CCCCCC"/>
+            </w:tcBorders>
+          </w:tcPr>
+          <w:p>
+            <w:r>
+              <w:rPr>
+                <w:b w:val="0"/>
+                <w:i w:val="0"/>
+                <w:sz w:val="18"/>
+              </w:rPr>
+              <w:t>Gracias por su atención. Quedamos disponibles para preguntas.</w:t>
+            </w:r>
+          </w:p>
+        </w:tc>
+        <w:tc>
+          <w:tcPr>
+            <w:tcW w:w="3685" w:type="dxa"/>
+            <w:shd w:val="clear" w:color="auto" w:fill="F2F2F2"/>
+            <w:tcBorders>
+              <w:top w:val="single" w:sz="4" w:space="0" w:color="CCCCCC"/>
+              <w:left w:val="single" w:sz="4" w:space="0" w:color="CCCCCC"/>
+              <w:bottom w:val="single" w:sz="4" w:space="0" w:color="CCCCCC"/>
+              <w:right w:val="single" w:sz="4" w:space="0" w:color="CCCCCC"/>
+            </w:tcBorders>
+          </w:tcPr>
+          <w:p>
+            <w:r>
+              <w:rPr>
+                <w:b w:val="0"/>
+                <w:i/>
+                <w:color w:val="7F7F7F"/>
+                <w:sz w:val="16"/>
+              </w:rPr>
+              <w:t>Pantalla: diapositiva final o terminal con el repositorio.</w:t>
+            </w:r>
+          </w:p>
+        </w:tc>
+      </w:tr>
+      <w:tr>
+        <w:tc>
+          <w:tcPr>
+            <w:tcW w:w="793" w:type="dxa"/>
+            <w:shd w:val="clear" w:color="auto" w:fill="FFFFFF"/>
+            <w:tcBorders>
+              <w:top w:val="single" w:sz="4" w:space="0" w:color="CCCCCC"/>
+              <w:left w:val="single" w:sz="4" w:space="0" w:color="CCCCCC"/>
+              <w:bottom w:val="single" w:sz="4" w:space="0" w:color="CCCCCC"/>
+              <w:right w:val="single" w:sz="4" w:space="0" w:color="CCCCCC"/>
+            </w:tcBorders>
+          </w:tcPr>
+          <w:p>
+            <w:pPr>
+              <w:jc w:val="center"/>
+            </w:pPr>
+            <w:r>
+              <w:rPr>
+                <w:b/>
+                <w:sz w:val="18"/>
+              </w:rPr>
+              <w:t>5:00</w:t>
+            </w:r>
+          </w:p>
+        </w:tc>
+        <w:tc>
+          <w:tcPr>
+            <w:tcW w:w="1360" w:type="dxa"/>
+            <w:shd w:val="clear" w:color="auto" w:fill="FFFFFF"/>
+            <w:tcBorders>
+              <w:top w:val="single" w:sz="4" w:space="0" w:color="CCCCCC"/>
+              <w:left w:val="single" w:sz="4" w:space="0" w:color="CCCCCC"/>
+              <w:bottom w:val="single" w:sz="4" w:space="0" w:color="CCCCCC"/>
+              <w:right w:val="single" w:sz="4" w:space="0" w:color="CCCCCC"/>
+            </w:tcBorders>
+          </w:tcPr>
+          <w:p>
+            <w:pPr>
+              <w:jc w:val="center"/>
+            </w:pPr>
+            <w:r>
+              <w:rPr>
+                <w:b/>
+                <w:i w:val="0"/>
+                <w:color w:val="1F497D"/>
+                <w:sz w:val="18"/>
+              </w:rPr>
+              <w:t>—</w:t>
+            </w:r>
+          </w:p>
+        </w:tc>
+        <w:tc>
+          <w:tcPr>
+            <w:tcW w:w="4819" w:type="dxa"/>
+            <w:shd w:val="clear" w:color="auto" w:fill="FFFFFF"/>
+            <w:tcBorders>
+              <w:top w:val="single" w:sz="4" w:space="0" w:color="CCCCCC"/>
+              <w:left w:val="single" w:sz="4" w:space="0" w:color="CCCCCC"/>
+              <w:bottom w:val="single" w:sz="4" w:space="0" w:color="CCCCCC"/>
+              <w:right w:val="single" w:sz="4" w:space="0" w:color="CCCCCC"/>
+            </w:tcBorders>
+          </w:tcPr>
+          <w:p>
+            <w:r>
+              <w:rPr>
+                <w:b w:val="0"/>
+                <w:i w:val="0"/>
+                <w:sz w:val="18"/>
+              </w:rPr>
+              <w:t>[FIN DEL VIDEO]</w:t>
+            </w:r>
+          </w:p>
+        </w:tc>
+        <w:tc>
+          <w:tcPr>
+            <w:tcW w:w="3685" w:type="dxa"/>
+            <w:shd w:val="clear" w:color="auto" w:fill="F2F2F2"/>
+            <w:tcBorders>
+              <w:top w:val="single" w:sz="4" w:space="0" w:color="CCCCCC"/>
+              <w:left w:val="single" w:sz="4" w:space="0" w:color="CCCCCC"/>
+              <w:bottom w:val="single" w:sz="4" w:space="0" w:color="CCCCCC"/>
+              <w:right w:val="single" w:sz="4" w:space="0" w:color="CCCCCC"/>
+            </w:tcBorders>
+          </w:tcPr>
+          <w:p>
+            <w:r>
+              <w:rPr>
+                <w:b w:val="0"/>
+                <w:i/>
+                <w:color w:val="7F7F7F"/>
+                <w:sz w:val="16"/>
+              </w:rPr>
+            </w:r>
+          </w:p>
+        </w:tc>
+      </w:tr>
+    </w:tbl>
     <w:p>
       <w:r>
         <w:br w:type="page"/>
       </w:r>
     </w:p>
     <w:p>
-      <w:pPr>
-        <w:pStyle w:val="Heading2"/>
-      </w:pPr>
       <w:r>
         <w:rPr>
-          <w:rFonts w:ascii="Calibri" w:hAnsi="Calibri"/>
-          <w:color w:val="2E75B6"/>
-          <w:sz w:val="26"/>
-        </w:rPr>
-        <w:t>SEGMENTO 1 — Introducción (0:00 – 1:00)</w:t>
-      </w:r>
-    </w:p>
-    <w:p>
-      <w:pPr>
-        <w:spacing w:before="80"/>
-        <w:ind w:left="432"/>
-      </w:pPr>
-      <w:r>
-        <w:rPr>
-          <w:rFonts w:ascii="Calibri" w:hAnsi="Calibri"/>
           <w:b/>
           <w:i w:val="0"/>
-          <w:color w:val="378637"/>
-          <w:sz w:val="21"/>
+          <w:color w:val="1F497D"/>
+          <w:sz w:val="24"/>
         </w:rPr>
-        <w:t xml:space="preserve">🖥  MOSTRAR: </w:t>
-      </w:r>
-      <w:r>
-        <w:rPr>
-          <w:rFonts w:ascii="Calibri" w:hAnsi="Calibri"/>
-          <w:b w:val="0"/>
-          <w:i w:val="0"/>
-          <w:color w:val="404040"/>
-          <w:sz w:val="21"/>
-        </w:rPr>
-        <w:t>Abrir el terminal en la carpeta raíz del proyecto.</w:t>
-      </w:r>
-    </w:p>
-    <w:p>
-      <w:pPr>
-        <w:spacing w:before="80"/>
-        <w:ind w:left="432"/>
-      </w:pPr>
-      <w:r>
-        <w:rPr>
-          <w:rFonts w:ascii="Calibri" w:hAnsi="Calibri"/>
-          <w:b/>
-          <w:i w:val="0"/>
-          <w:color w:val="1F5694"/>
-          <w:sz w:val="21"/>
-        </w:rPr>
-        <w:t xml:space="preserve">🎤 DECIR: </w:t>
-      </w:r>
-      <w:r>
-        <w:rPr>
-          <w:rFonts w:ascii="Calibri" w:hAnsi="Calibri"/>
-          <w:b w:val="0"/>
-          <w:i/>
-          <w:color w:val="404040"/>
-          <w:sz w:val="21"/>
-        </w:rPr>
-        <w:t>Buenos días / buenas tardes. Mi nombre es Mateo Mejía, estudiante de Análisis y Diseño de Algoritmos de la Universidad de Caldas. En este video presento el proyecto K-QGMIP: una extensión de los algoritmos QNodes y GeoMIP para encontrar la Partición de Mínima Información con k grupos, en lugar de la bipartición clásica.</w:t>
-      </w:r>
-    </w:p>
-    <w:p>
-      <w:pPr>
-        <w:spacing w:before="80"/>
-        <w:ind w:left="432"/>
-      </w:pPr>
-      <w:r>
-        <w:rPr>
-          <w:rFonts w:ascii="Calibri" w:hAnsi="Calibri"/>
-          <w:b/>
-          <w:i w:val="0"/>
-          <w:color w:val="378637"/>
-          <w:sz w:val="21"/>
-        </w:rPr>
-        <w:t xml:space="preserve">🖥  MOSTRAR: </w:t>
-      </w:r>
-      <w:r>
-        <w:rPr>
-          <w:rFonts w:ascii="Calibri" w:hAnsi="Calibri"/>
-          <w:b w:val="0"/>
-          <w:i w:val="0"/>
-          <w:color w:val="404040"/>
-          <w:sz w:val="21"/>
-        </w:rPr>
-        <w:t>Ejecutar: ls (mostrar la estructura de carpetas)</w:t>
-      </w:r>
-    </w:p>
-    <w:p>
-      <w:pPr>
-        <w:spacing w:before="80"/>
-        <w:ind w:left="432"/>
-      </w:pPr>
-      <w:r>
-        <w:rPr>
-          <w:rFonts w:ascii="Calibri" w:hAnsi="Calibri"/>
-          <w:b/>
-          <w:i w:val="0"/>
-          <w:color w:val="1F5694"/>
-          <w:sz w:val="21"/>
-        </w:rPr>
-        <w:t xml:space="preserve">🎤 DECIR: </w:t>
-      </w:r>
-      <w:r>
-        <w:rPr>
-          <w:rFonts w:ascii="Calibri" w:hAnsi="Calibri"/>
-          <w:b w:val="0"/>
-          <w:i/>
-          <w:color w:val="404040"/>
-          <w:sz w:val="21"/>
-        </w:rPr>
-        <w:t>El repositorio contiene tres módulos principales: el Módulo A, que es kpartir; el Módulo B, KQNodes; y el Módulo C, KGeometricSIA, también conocido como KGeoMIP. Adicionalmente tenemos la interfaz interactiva y el script de verificación integral.</w:t>
-      </w:r>
-    </w:p>
-    <w:p>
-      <w:pPr>
-        <w:pStyle w:val="Heading2"/>
-      </w:pPr>
-      <w:r>
-        <w:rPr>
-          <w:rFonts w:ascii="Calibri" w:hAnsi="Calibri"/>
-          <w:color w:val="2E75B6"/>
-          <w:sz w:val="26"/>
-        </w:rPr>
-        <w:t>SEGMENTO 2 — Verificación de los 16 tests (1:00 – 2:30)</w:t>
-      </w:r>
-    </w:p>
-    <w:p>
-      <w:pPr>
-        <w:spacing w:before="80"/>
-        <w:ind w:left="432"/>
-      </w:pPr>
-      <w:r>
-        <w:rPr>
-          <w:rFonts w:ascii="Calibri" w:hAnsi="Calibri"/>
-          <w:b/>
-          <w:i w:val="0"/>
-          <w:color w:val="378637"/>
-          <w:sz w:val="21"/>
-        </w:rPr>
-        <w:t xml:space="preserve">🖥  MOSTRAR: </w:t>
-      </w:r>
-      <w:r>
-        <w:rPr>
-          <w:rFonts w:ascii="Calibri" w:hAnsi="Calibri"/>
-          <w:b w:val="0"/>
-          <w:i w:val="0"/>
-          <w:color w:val="404040"/>
-          <w:sz w:val="21"/>
-        </w:rPr>
-        <w:t>Ejecutar: python3 verificar_todo.py</w:t>
-      </w:r>
-    </w:p>
-    <w:p>
-      <w:pPr>
-        <w:spacing w:before="80"/>
-        <w:ind w:left="432"/>
-      </w:pPr>
-      <w:r>
-        <w:rPr>
-          <w:rFonts w:ascii="Calibri" w:hAnsi="Calibri"/>
-          <w:b/>
-          <w:i w:val="0"/>
-          <w:color w:val="1F5694"/>
-          <w:sz w:val="21"/>
-        </w:rPr>
-        <w:t xml:space="preserve">🎤 DECIR: </w:t>
-      </w:r>
-      <w:r>
-        <w:rPr>
-          <w:rFonts w:ascii="Calibri" w:hAnsi="Calibri"/>
-          <w:b w:val="0"/>
-          <w:i/>
-          <w:color w:val="404040"/>
-          <w:sz w:val="21"/>
-        </w:rPr>
-        <w:t>Antes de mostrar la interfaz, ejecutamos el script de verificación integral. Este script lanza cada módulo en un subproceso aislado, lo que evita conflictos entre los paquetes QNodes y GeoMIP, que comparten el mismo nombre de módulo 'src'.</w:t>
-      </w:r>
-    </w:p>
-    <w:p>
-      <w:pPr>
-        <w:spacing w:before="80"/>
-        <w:ind w:left="432"/>
-      </w:pPr>
-      <w:r>
-        <w:rPr>
-          <w:rFonts w:ascii="Calibri" w:hAnsi="Calibri"/>
-          <w:b/>
-          <w:i w:val="0"/>
-          <w:color w:val="404040"/>
-          <w:sz w:val="21"/>
-        </w:rPr>
-        <w:t xml:space="preserve">⏳ ESPERAR: </w:t>
-      </w:r>
-      <w:r>
-        <w:rPr>
-          <w:rFonts w:ascii="Calibri" w:hAnsi="Calibri"/>
-          <w:b w:val="0"/>
-          <w:i/>
-          <w:color w:val="404040"/>
-          <w:sz w:val="21"/>
-        </w:rPr>
-        <w:t>Esperar a que aparezca SISTEMA VALIDADO.</w:t>
-      </w:r>
-    </w:p>
-    <w:p>
-      <w:pPr>
-        <w:spacing w:before="80"/>
-        <w:ind w:left="432"/>
-      </w:pPr>
-      <w:r>
-        <w:rPr>
-          <w:rFonts w:ascii="Calibri" w:hAnsi="Calibri"/>
-          <w:b/>
-          <w:i w:val="0"/>
-          <w:color w:val="1F5694"/>
-          <w:sz w:val="21"/>
-        </w:rPr>
-        <w:t xml:space="preserve">🎤 DECIR: </w:t>
-      </w:r>
-      <w:r>
-        <w:rPr>
-          <w:rFonts w:ascii="Calibri" w:hAnsi="Calibri"/>
-          <w:b w:val="0"/>
-          <w:i/>
-          <w:color w:val="404040"/>
-          <w:sz w:val="21"/>
-        </w:rPr>
-        <w:t>Perfecto. Los tres módulos pasan sus verificaciones. El Módulo A verifica que kpartir con k=3 produce distribuciones válidas. El Módulo B confirma que KQNodes genera exactamente k grupos con cobertura total. Y el Módulo C valida que la tabla BFS/DP tiene valores en [0,1] y que los candidatos geométricos son correctos.</w:t>
-      </w:r>
-    </w:p>
-    <w:p>
-      <w:pPr>
-        <w:pStyle w:val="Heading2"/>
-      </w:pPr>
-      <w:r>
-        <w:rPr>
-          <w:rFonts w:ascii="Calibri" w:hAnsi="Calibri"/>
-          <w:color w:val="2E75B6"/>
-          <w:sz w:val="26"/>
-        </w:rPr>
-        <w:t>SEGMENTO 3 — Correr las suites de tests (2:30 – 4:00)</w:t>
-      </w:r>
-    </w:p>
-    <w:p>
-      <w:pPr>
-        <w:spacing w:before="80"/>
-        <w:ind w:left="432"/>
-      </w:pPr>
-      <w:r>
-        <w:rPr>
-          <w:rFonts w:ascii="Calibri" w:hAnsi="Calibri"/>
-          <w:b/>
-          <w:i w:val="0"/>
-          <w:color w:val="378637"/>
-          <w:sz w:val="21"/>
-        </w:rPr>
-        <w:t xml:space="preserve">🖥  MOSTRAR: </w:t>
-      </w:r>
-      <w:r>
-        <w:rPr>
-          <w:rFonts w:ascii="Calibri" w:hAnsi="Calibri"/>
-          <w:b w:val="0"/>
-          <w:i w:val="0"/>
-          <w:color w:val="404040"/>
-          <w:sz w:val="21"/>
-        </w:rPr>
-        <w:t>Ejecutar: python3 QNodes/tests/test_kpartir.py</w:t>
-      </w:r>
-    </w:p>
-    <w:p>
-      <w:pPr>
-        <w:spacing w:before="80"/>
-        <w:ind w:left="432"/>
-      </w:pPr>
-      <w:r>
-        <w:rPr>
-          <w:rFonts w:ascii="Calibri" w:hAnsi="Calibri"/>
-          <w:b/>
-          <w:i w:val="0"/>
-          <w:color w:val="1F5694"/>
-          <w:sz w:val="21"/>
-        </w:rPr>
-        <w:t xml:space="preserve">🎤 DECIR: </w:t>
-      </w:r>
-      <w:r>
-        <w:rPr>
-          <w:rFonts w:ascii="Calibri" w:hAnsi="Calibri"/>
-          <w:b w:val="0"/>
-          <w:i/>
-          <w:color w:val="404040"/>
-          <w:sz w:val="21"/>
-        </w:rPr>
-        <w:t>Ahora vemos las suites de tests individuales. El Módulo A tiene 5 tests: verifica que kpartir con k=2 equivale a bipartir, que produce distribuciones válidas para k=3, que lanza ValueError si la cobertura es incompleta, que la memoización funciona, y que los grupos singleton marginalizan correctamente.</w:t>
-      </w:r>
-    </w:p>
-    <w:p>
-      <w:pPr>
-        <w:spacing w:before="80"/>
-        <w:ind w:left="432"/>
-      </w:pPr>
-      <w:r>
-        <w:rPr>
-          <w:rFonts w:ascii="Calibri" w:hAnsi="Calibri"/>
-          <w:b/>
-          <w:i w:val="0"/>
-          <w:color w:val="378637"/>
-          <w:sz w:val="21"/>
-        </w:rPr>
-        <w:t xml:space="preserve">🖥  MOSTRAR: </w:t>
-      </w:r>
-      <w:r>
-        <w:rPr>
-          <w:rFonts w:ascii="Calibri" w:hAnsi="Calibri"/>
-          <w:b w:val="0"/>
-          <w:i w:val="0"/>
-          <w:color w:val="404040"/>
-          <w:sz w:val="21"/>
-        </w:rPr>
-        <w:t>Ejecutar: python3 QNodes/tests/test_kqnodes.py</w:t>
-      </w:r>
-    </w:p>
-    <w:p>
-      <w:pPr>
-        <w:spacing w:before="80"/>
-        <w:ind w:left="432"/>
-      </w:pPr>
-      <w:r>
-        <w:rPr>
-          <w:rFonts w:ascii="Calibri" w:hAnsi="Calibri"/>
-          <w:b/>
-          <w:i w:val="0"/>
-          <w:color w:val="1F5694"/>
-          <w:sz w:val="21"/>
-        </w:rPr>
-        <w:t xml:space="preserve">🎤 DECIR: </w:t>
-      </w:r>
-      <w:r>
-        <w:rPr>
-          <w:rFonts w:ascii="Calibri" w:hAnsi="Calibri"/>
-          <w:b w:val="0"/>
-          <w:i/>
-          <w:color w:val="404040"/>
-          <w:sz w:val="21"/>
-        </w:rPr>
-        <w:t>El Módulo B tiene 6 tests para KQNodes: cobertura exacta de k grupos, respeto del max_size en cada fase, determinismo ante mismas entradas y formato correcto de la partición.</w:t>
-      </w:r>
-    </w:p>
-    <w:p>
-      <w:pPr>
-        <w:spacing w:before="80"/>
-        <w:ind w:left="432"/>
-      </w:pPr>
-      <w:r>
-        <w:rPr>
-          <w:rFonts w:ascii="Calibri" w:hAnsi="Calibri"/>
-          <w:b/>
-          <w:i w:val="0"/>
-          <w:color w:val="378637"/>
-          <w:sz w:val="21"/>
-        </w:rPr>
-        <w:t xml:space="preserve">🖥  MOSTRAR: </w:t>
-      </w:r>
-      <w:r>
-        <w:rPr>
-          <w:rFonts w:ascii="Calibri" w:hAnsi="Calibri"/>
-          <w:b w:val="0"/>
-          <w:i w:val="0"/>
-          <w:color w:val="404040"/>
-          <w:sz w:val="21"/>
-        </w:rPr>
-        <w:t>Ejecutar: python3 QNodes/tests/test_kgeomip.py</w:t>
-      </w:r>
-    </w:p>
-    <w:p>
-      <w:pPr>
-        <w:spacing w:before="80"/>
-        <w:ind w:left="432"/>
-      </w:pPr>
-      <w:r>
-        <w:rPr>
-          <w:rFonts w:ascii="Calibri" w:hAnsi="Calibri"/>
-          <w:b/>
-          <w:i w:val="0"/>
-          <w:color w:val="1F5694"/>
-          <w:sz w:val="21"/>
-        </w:rPr>
-        <w:t xml:space="preserve">🎤 DECIR: </w:t>
-      </w:r>
-      <w:r>
-        <w:rPr>
-          <w:rFonts w:ascii="Calibri" w:hAnsi="Calibri"/>
-          <w:b w:val="0"/>
-          <w:i/>
-          <w:color w:val="404040"/>
-          <w:sz w:val="21"/>
-        </w:rPr>
-        <w:t>Y el Módulo C tiene 5 tests para KGeometricSIA: tabla de costos en [0,1], candidatos con k grupos, distribución kpartir válida, find_mip retorna pérdida no negativa, y cobertura total de variables futuras.</w:t>
-      </w:r>
-    </w:p>
-    <w:p>
-      <w:pPr>
-        <w:spacing w:before="80"/>
-        <w:ind w:left="432"/>
-      </w:pPr>
-      <w:r>
-        <w:rPr>
-          <w:rFonts w:ascii="Calibri" w:hAnsi="Calibri"/>
-          <w:b/>
-          <w:i w:val="0"/>
-          <w:color w:val="1F5694"/>
-          <w:sz w:val="21"/>
-        </w:rPr>
-        <w:t xml:space="preserve">🎤 DECIR: </w:t>
-      </w:r>
-      <w:r>
-        <w:rPr>
-          <w:rFonts w:ascii="Calibri" w:hAnsi="Calibri"/>
-          <w:b w:val="0"/>
-          <w:i/>
-          <w:color w:val="404040"/>
-          <w:sz w:val="21"/>
-        </w:rPr>
-        <w:t>16 tests, 16 PASS. El motor es completamente funcional.</w:t>
-      </w:r>
-    </w:p>
-    <w:p>
-      <w:pPr>
-        <w:pStyle w:val="Heading2"/>
-      </w:pPr>
-      <w:r>
-        <w:rPr>
-          <w:rFonts w:ascii="Calibri" w:hAnsi="Calibri"/>
-          <w:color w:val="2E75B6"/>
-          <w:sz w:val="26"/>
-        </w:rPr>
-        <w:t>SEGMENTO 4 — Demostración de la interfaz (4:00 – 8:00)</w:t>
-      </w:r>
-    </w:p>
-    <w:p>
-      <w:pPr>
-        <w:spacing w:before="80"/>
-        <w:ind w:left="432"/>
-      </w:pPr>
-      <w:r>
-        <w:rPr>
-          <w:rFonts w:ascii="Calibri" w:hAnsi="Calibri"/>
-          <w:b/>
-          <w:i w:val="0"/>
-          <w:color w:val="378637"/>
-          <w:sz w:val="21"/>
-        </w:rPr>
-        <w:t xml:space="preserve">🖥  MOSTRAR: </w:t>
-      </w:r>
-      <w:r>
-        <w:rPr>
-          <w:rFonts w:ascii="Calibri" w:hAnsi="Calibri"/>
-          <w:b w:val="0"/>
-          <w:i w:val="0"/>
-          <w:color w:val="404040"/>
-          <w:sz w:val="21"/>
-        </w:rPr>
-        <w:t>Ejecutar: python3 interfaz_kqmip.py</w:t>
-      </w:r>
-    </w:p>
-    <w:p>
-      <w:pPr>
-        <w:spacing w:before="80"/>
-        <w:ind w:left="432"/>
-      </w:pPr>
-      <w:r>
-        <w:rPr>
-          <w:rFonts w:ascii="Calibri" w:hAnsi="Calibri"/>
-          <w:b/>
-          <w:i w:val="0"/>
-          <w:color w:val="1F5694"/>
-          <w:sz w:val="21"/>
-        </w:rPr>
-        <w:t xml:space="preserve">🎤 DECIR: </w:t>
-      </w:r>
-      <w:r>
-        <w:rPr>
-          <w:rFonts w:ascii="Calibri" w:hAnsi="Calibri"/>
-          <w:b w:val="0"/>
-          <w:i/>
-          <w:color w:val="404040"/>
-          <w:sz w:val="21"/>
-        </w:rPr>
-        <w:t>Ahora la demostración principal: la interfaz interactiva. Al ejecutar el script aparece el banner K-QGMIP y se muestra el menú de selección de archivo.</w:t>
-      </w:r>
-    </w:p>
-    <w:p>
-      <w:pPr>
-        <w:spacing w:before="80"/>
-        <w:ind w:left="432"/>
-      </w:pPr>
-      <w:r>
-        <w:rPr>
-          <w:rFonts w:ascii="Calibri" w:hAnsi="Calibri"/>
-          <w:b/>
-          <w:i w:val="0"/>
-          <w:color w:val="378637"/>
-          <w:sz w:val="21"/>
-        </w:rPr>
-        <w:t xml:space="preserve">🖥  MOSTRAR: </w:t>
-      </w:r>
-      <w:r>
-        <w:rPr>
-          <w:rFonts w:ascii="Calibri" w:hAnsi="Calibri"/>
-          <w:b w:val="0"/>
-          <w:i w:val="0"/>
-          <w:color w:val="404040"/>
-          <w:sz w:val="21"/>
-        </w:rPr>
-        <w:t>El menú numerado de CSVs aparece automáticamente.</w:t>
-      </w:r>
-    </w:p>
-    <w:p>
-      <w:pPr>
-        <w:spacing w:before="80"/>
-        <w:ind w:left="432"/>
-      </w:pPr>
-      <w:r>
-        <w:rPr>
-          <w:rFonts w:ascii="Calibri" w:hAnsi="Calibri"/>
-          <w:b/>
-          <w:i w:val="0"/>
-          <w:color w:val="1F5694"/>
-          <w:sz w:val="21"/>
-        </w:rPr>
-        <w:t xml:space="preserve">🎤 DECIR: </w:t>
-      </w:r>
-      <w:r>
-        <w:rPr>
-          <w:rFonts w:ascii="Calibri" w:hAnsi="Calibri"/>
-          <w:b w:val="0"/>
-          <w:i/>
-          <w:color w:val="404040"/>
-          <w:sz w:val="21"/>
-        </w:rPr>
-        <w:t>La interfaz escanea automáticamente las carpetas de muestras y presenta un menú numerado. Vemos los archivos disponibles con el número de variables, estados y una recomendación de qué algoritmo usar.</w:t>
-      </w:r>
-    </w:p>
-    <w:p>
-      <w:pPr>
-        <w:spacing w:before="80"/>
-        <w:ind w:left="432"/>
-      </w:pPr>
-      <w:r>
-        <w:rPr>
-          <w:rFonts w:ascii="Calibri" w:hAnsi="Calibri"/>
-          <w:b/>
-          <w:i w:val="0"/>
-          <w:color w:val="BF8F00"/>
-          <w:sz w:val="21"/>
-        </w:rPr>
-        <w:t xml:space="preserve">⌨  HACER: </w:t>
-      </w:r>
-      <w:r>
-        <w:rPr>
-          <w:rFonts w:ascii="Calibri" w:hAnsi="Calibri"/>
-          <w:b w:val="0"/>
-          <w:i w:val="0"/>
-          <w:color w:val="000000"/>
-          <w:sz w:val="21"/>
-        </w:rPr>
-        <w:t>Escribir: 2 [ENTER] — seleccionar N3A.csv (3 variables, 8 estados)</w:t>
-      </w:r>
-    </w:p>
-    <w:p>
-      <w:pPr>
-        <w:spacing w:before="80"/>
-        <w:ind w:left="432"/>
-      </w:pPr>
-      <w:r>
-        <w:rPr>
-          <w:rFonts w:ascii="Calibri" w:hAnsi="Calibri"/>
-          <w:b/>
-          <w:i w:val="0"/>
-          <w:color w:val="1F5694"/>
-          <w:sz w:val="21"/>
-        </w:rPr>
-        <w:t xml:space="preserve">🎤 DECIR: </w:t>
-      </w:r>
-      <w:r>
-        <w:rPr>
-          <w:rFonts w:ascii="Calibri" w:hAnsi="Calibri"/>
-          <w:b w:val="0"/>
-          <w:i/>
-          <w:color w:val="404040"/>
-          <w:sz w:val="21"/>
-        </w:rPr>
-        <w:t>Selecciono el sistema N3A.csv, que tiene 3 variables y 8 estados. La interfaz muestra la vista previa de la matriz de probabilidad de transición.</w:t>
-      </w:r>
-    </w:p>
-    <w:p>
-      <w:pPr>
-        <w:spacing w:before="80"/>
-        <w:ind w:left="432"/>
-      </w:pPr>
-      <w:r>
-        <w:rPr>
-          <w:rFonts w:ascii="Calibri" w:hAnsi="Calibri"/>
-          <w:b/>
-          <w:i w:val="0"/>
-          <w:color w:val="BF8F00"/>
-          <w:sz w:val="21"/>
-        </w:rPr>
-        <w:t xml:space="preserve">⌨  HACER: </w:t>
-      </w:r>
-      <w:r>
-        <w:rPr>
-          <w:rFonts w:ascii="Calibri" w:hAnsi="Calibri"/>
-          <w:b w:val="0"/>
-          <w:i w:val="0"/>
-          <w:color w:val="000000"/>
-          <w:sz w:val="21"/>
-        </w:rPr>
-        <w:t>Confirmar la TPM con ENTER (respuesta por defecto S)</w:t>
-      </w:r>
-    </w:p>
-    <w:p>
-      <w:pPr>
-        <w:spacing w:before="80"/>
-        <w:ind w:left="432"/>
-      </w:pPr>
-      <w:r>
-        <w:rPr>
-          <w:rFonts w:ascii="Calibri" w:hAnsi="Calibri"/>
-          <w:b/>
-          <w:i w:val="0"/>
-          <w:color w:val="1F5694"/>
-          <w:sz w:val="21"/>
-        </w:rPr>
-        <w:t xml:space="preserve">🎤 DECIR: </w:t>
-      </w:r>
-      <w:r>
-        <w:rPr>
-          <w:rFonts w:ascii="Calibri" w:hAnsi="Calibri"/>
-          <w:b w:val="0"/>
-          <w:i/>
-          <w:color w:val="404040"/>
-          <w:sz w:val="21"/>
-        </w:rPr>
-        <w:t>Confirmo que es la TPM correcta. Ahora ingresamos el estado inicial. Usamos el estado todo-ceros, que es el más común en el análisis SIA.</w:t>
-      </w:r>
-    </w:p>
-    <w:p>
-      <w:pPr>
-        <w:spacing w:before="80"/>
-        <w:ind w:left="432"/>
-      </w:pPr>
-      <w:r>
-        <w:rPr>
-          <w:rFonts w:ascii="Calibri" w:hAnsi="Calibri"/>
-          <w:b/>
-          <w:i w:val="0"/>
-          <w:color w:val="BF8F00"/>
-          <w:sz w:val="21"/>
-        </w:rPr>
-        <w:t xml:space="preserve">⌨  HACER: </w:t>
-      </w:r>
-      <w:r>
-        <w:rPr>
-          <w:rFonts w:ascii="Calibri" w:hAnsi="Calibri"/>
-          <w:b w:val="0"/>
-          <w:i w:val="0"/>
-          <w:color w:val="000000"/>
-          <w:sz w:val="21"/>
-        </w:rPr>
-        <w:t>Presionar ENTER (estado por defecto 000)</w:t>
-      </w:r>
-    </w:p>
-    <w:p>
-      <w:pPr>
-        <w:spacing w:before="80"/>
-        <w:ind w:left="432"/>
-      </w:pPr>
-      <w:r>
-        <w:rPr>
-          <w:rFonts w:ascii="Calibri" w:hAnsi="Calibri"/>
-          <w:b/>
-          <w:i w:val="0"/>
-          <w:color w:val="1F5694"/>
-          <w:sz w:val="21"/>
-        </w:rPr>
-        <w:t xml:space="preserve">🎤 DECIR: </w:t>
-      </w:r>
-      <w:r>
-        <w:rPr>
-          <w:rFonts w:ascii="Calibri" w:hAnsi="Calibri"/>
-          <w:b w:val="0"/>
-          <w:i/>
-          <w:color w:val="404040"/>
-          <w:sz w:val="21"/>
-        </w:rPr>
-        <w:t>La interfaz fija automáticamente el alcance y mecanismo a 'todos los nodos'. Ahora elegimos el algoritmo. Vamos a demostrar primero KQNodes.</w:t>
-      </w:r>
-    </w:p>
-    <w:p>
-      <w:pPr>
-        <w:spacing w:before="80"/>
-        <w:ind w:left="432"/>
-      </w:pPr>
-      <w:r>
-        <w:rPr>
-          <w:rFonts w:ascii="Calibri" w:hAnsi="Calibri"/>
-          <w:b/>
-          <w:i w:val="0"/>
-          <w:color w:val="BF8F00"/>
-          <w:sz w:val="21"/>
-        </w:rPr>
-        <w:t xml:space="preserve">⌨  HACER: </w:t>
-      </w:r>
-      <w:r>
-        <w:rPr>
-          <w:rFonts w:ascii="Calibri" w:hAnsi="Calibri"/>
-          <w:b w:val="0"/>
-          <w:i w:val="0"/>
-          <w:color w:val="000000"/>
-          <w:sz w:val="21"/>
-        </w:rPr>
-        <w:t>Escribir: 1 [ENTER] — KQNodes</w:t>
-      </w:r>
-    </w:p>
-    <w:p>
-      <w:pPr>
-        <w:spacing w:before="80"/>
-        <w:ind w:left="432"/>
-      </w:pPr>
-      <w:r>
-        <w:rPr>
-          <w:rFonts w:ascii="Calibri" w:hAnsi="Calibri"/>
-          <w:b/>
-          <w:i w:val="0"/>
-          <w:color w:val="BF8F00"/>
-          <w:sz w:val="21"/>
-        </w:rPr>
-        <w:t xml:space="preserve">⌨  HACER: </w:t>
-      </w:r>
-      <w:r>
-        <w:rPr>
-          <w:rFonts w:ascii="Calibri" w:hAnsi="Calibri"/>
-          <w:b w:val="0"/>
-          <w:i w:val="0"/>
-          <w:color w:val="000000"/>
-          <w:sz w:val="21"/>
-        </w:rPr>
-        <w:t>Escribir: 3 [ENTER] — k = 3 grupos</w:t>
-      </w:r>
-    </w:p>
-    <w:p>
-      <w:pPr>
-        <w:spacing w:before="80"/>
-        <w:ind w:left="432"/>
-      </w:pPr>
-      <w:r>
-        <w:rPr>
-          <w:rFonts w:ascii="Calibri" w:hAnsi="Calibri"/>
-          <w:b/>
-          <w:i w:val="0"/>
-          <w:color w:val="1F5694"/>
-          <w:sz w:val="21"/>
-        </w:rPr>
-        <w:t xml:space="preserve">🎤 DECIR: </w:t>
-      </w:r>
-      <w:r>
-        <w:rPr>
-          <w:rFonts w:ascii="Calibri" w:hAnsi="Calibri"/>
-          <w:b w:val="0"/>
-          <w:i/>
-          <w:color w:val="404040"/>
-          <w:sz w:val="21"/>
-        </w:rPr>
-        <w:t>Pedimos una tri-partición: dividir el sistema en 3 grupos independientes. Confirmamos y ejecutamos.</w:t>
-      </w:r>
-    </w:p>
-    <w:p>
-      <w:pPr>
-        <w:spacing w:before="80"/>
-        <w:ind w:left="432"/>
-      </w:pPr>
-      <w:r>
-        <w:rPr>
-          <w:rFonts w:ascii="Calibri" w:hAnsi="Calibri"/>
-          <w:b/>
-          <w:i w:val="0"/>
-          <w:color w:val="BF8F00"/>
-          <w:sz w:val="21"/>
-        </w:rPr>
-        <w:t xml:space="preserve">⌨  HACER: </w:t>
-      </w:r>
-      <w:r>
-        <w:rPr>
-          <w:rFonts w:ascii="Calibri" w:hAnsi="Calibri"/>
-          <w:b w:val="0"/>
-          <w:i w:val="0"/>
-          <w:color w:val="000000"/>
-          <w:sz w:val="21"/>
-        </w:rPr>
-        <w:t>Presionar ENTER para confirmar</w:t>
-      </w:r>
-    </w:p>
-    <w:p>
-      <w:pPr>
-        <w:spacing w:before="80"/>
-        <w:ind w:left="432"/>
-      </w:pPr>
-      <w:r>
-        <w:rPr>
-          <w:rFonts w:ascii="Calibri" w:hAnsi="Calibri"/>
-          <w:b/>
-          <w:i w:val="0"/>
-          <w:color w:val="404040"/>
-          <w:sz w:val="21"/>
-        </w:rPr>
-        <w:t xml:space="preserve">⏳ ESPERAR: </w:t>
-      </w:r>
-      <w:r>
-        <w:rPr>
-          <w:rFonts w:ascii="Calibri" w:hAnsi="Calibri"/>
-          <w:b w:val="0"/>
-          <w:i/>
-          <w:color w:val="404040"/>
-          <w:sz w:val="21"/>
-        </w:rPr>
-        <w:t>Ver la barra de progreso de fases en tiempo real.</w:t>
-      </w:r>
-    </w:p>
-    <w:p>
-      <w:pPr>
-        <w:spacing w:before="80"/>
-        <w:ind w:left="432"/>
-      </w:pPr>
-      <w:r>
-        <w:rPr>
-          <w:rFonts w:ascii="Calibri" w:hAnsi="Calibri"/>
-          <w:b/>
-          <w:i w:val="0"/>
-          <w:color w:val="1F5694"/>
-          <w:sz w:val="21"/>
-        </w:rPr>
-        <w:t xml:space="preserve">🎤 DECIR: </w:t>
-      </w:r>
-      <w:r>
-        <w:rPr>
-          <w:rFonts w:ascii="Calibri" w:hAnsi="Calibri"/>
-          <w:b w:val="0"/>
-          <w:i/>
-          <w:color w:val="404040"/>
-          <w:sz w:val="21"/>
-        </w:rPr>
-        <w:t>Observen la barra de progreso: KQNodes trabaja en k-1 = 2 fases. En cada fase selecciona el grupo que minimiza la EMD acumulada.</w:t>
-      </w:r>
-    </w:p>
-    <w:p>
-      <w:pPr>
-        <w:spacing w:before="80"/>
-        <w:ind w:left="432"/>
-      </w:pPr>
-      <w:r>
-        <w:rPr>
-          <w:rFonts w:ascii="Calibri" w:hAnsi="Calibri"/>
-          <w:b/>
-          <w:i w:val="0"/>
-          <w:color w:val="404040"/>
-          <w:sz w:val="21"/>
-        </w:rPr>
-        <w:t xml:space="preserve">⏳ ESPERAR: </w:t>
-      </w:r>
-      <w:r>
-        <w:rPr>
-          <w:rFonts w:ascii="Calibri" w:hAnsi="Calibri"/>
-          <w:b w:val="0"/>
-          <w:i/>
-          <w:color w:val="404040"/>
-          <w:sz w:val="21"/>
-        </w:rPr>
-        <w:t>Aparece la tabla de resultados.</w:t>
-      </w:r>
-    </w:p>
-    <w:p>
-      <w:pPr>
-        <w:spacing w:before="80"/>
-        <w:ind w:left="432"/>
-      </w:pPr>
-      <w:r>
-        <w:rPr>
-          <w:rFonts w:ascii="Calibri" w:hAnsi="Calibri"/>
-          <w:b/>
-          <w:i w:val="0"/>
-          <w:color w:val="1F5694"/>
-          <w:sz w:val="21"/>
-        </w:rPr>
-        <w:t xml:space="preserve">🎤 DECIR: </w:t>
-      </w:r>
-      <w:r>
-        <w:rPr>
-          <w:rFonts w:ascii="Calibri" w:hAnsi="Calibri"/>
-          <w:b w:val="0"/>
-          <w:i/>
-          <w:color w:val="404040"/>
-          <w:sz w:val="21"/>
-        </w:rPr>
-        <w:t>Aquí está el resultado: la Partición de Mínima Información para k=3. Vemos la pérdida EMD, el tiempo de cómputo y la partición encontrada con la notación Gj:{Futuros|Mecanismos}. La interpretación automática nos dice si la integración causal es baja, moderada o alta.</w:t>
-      </w:r>
-    </w:p>
-    <w:p>
-      <w:pPr>
-        <w:spacing w:before="80"/>
-        <w:ind w:left="432"/>
-      </w:pPr>
-      <w:r>
-        <w:rPr>
-          <w:rFonts w:ascii="Calibri" w:hAnsi="Calibri"/>
-          <w:b/>
-          <w:i w:val="0"/>
-          <w:color w:val="BF8F00"/>
-          <w:sz w:val="21"/>
-        </w:rPr>
-        <w:t xml:space="preserve">⌨  HACER: </w:t>
-      </w:r>
-      <w:r>
-        <w:rPr>
-          <w:rFonts w:ascii="Calibri" w:hAnsi="Calibri"/>
-          <w:b w:val="0"/>
-          <w:i w:val="0"/>
-          <w:color w:val="000000"/>
-          <w:sz w:val="21"/>
-        </w:rPr>
-        <w:t>Guardar resultado: S [ENTER]</w:t>
-      </w:r>
-    </w:p>
-    <w:p>
-      <w:pPr>
-        <w:spacing w:before="80"/>
-        <w:ind w:left="432"/>
-      </w:pPr>
-      <w:r>
-        <w:rPr>
-          <w:rFonts w:ascii="Calibri" w:hAnsi="Calibri"/>
-          <w:b/>
-          <w:i w:val="0"/>
-          <w:color w:val="1F5694"/>
-          <w:sz w:val="21"/>
-        </w:rPr>
-        <w:t xml:space="preserve">🎤 DECIR: </w:t>
-      </w:r>
-      <w:r>
-        <w:rPr>
-          <w:rFonts w:ascii="Calibri" w:hAnsi="Calibri"/>
-          <w:b w:val="0"/>
-          <w:i/>
-          <w:color w:val="404040"/>
-          <w:sz w:val="21"/>
-        </w:rPr>
-        <w:t>El resultado se guarda en un archivo .txt junto al CSV.</w:t>
-      </w:r>
-    </w:p>
-    <w:p>
-      <w:pPr>
-        <w:spacing w:before="80"/>
-        <w:ind w:left="432"/>
-      </w:pPr>
-      <w:r>
-        <w:rPr>
-          <w:rFonts w:ascii="Calibri" w:hAnsi="Calibri"/>
-          <w:b/>
-          <w:i w:val="0"/>
-          <w:color w:val="BF8F00"/>
-          <w:sz w:val="21"/>
-        </w:rPr>
-        <w:t xml:space="preserve">⌨  HACER: </w:t>
-      </w:r>
-      <w:r>
-        <w:rPr>
-          <w:rFonts w:ascii="Calibri" w:hAnsi="Calibri"/>
-          <w:b w:val="0"/>
-          <w:i w:val="0"/>
-          <w:color w:val="000000"/>
-          <w:sz w:val="21"/>
-        </w:rPr>
-        <w:t>Analizar otro sistema: s [ENTER]</w:t>
-      </w:r>
-    </w:p>
-    <w:p>
-      <w:pPr>
-        <w:spacing w:before="80"/>
-        <w:ind w:left="432"/>
-      </w:pPr>
-      <w:r>
-        <w:rPr>
-          <w:rFonts w:ascii="Calibri" w:hAnsi="Calibri"/>
-          <w:b/>
-          <w:i w:val="0"/>
-          <w:color w:val="1F5694"/>
-          <w:sz w:val="21"/>
-        </w:rPr>
-        <w:t xml:space="preserve">🎤 DECIR: </w:t>
-      </w:r>
-      <w:r>
-        <w:rPr>
-          <w:rFonts w:ascii="Calibri" w:hAnsi="Calibri"/>
-          <w:b w:val="0"/>
-          <w:i/>
-          <w:color w:val="404040"/>
-          <w:sz w:val="21"/>
-        </w:rPr>
-        <w:t>Repetimos el proceso pero ahora con KGeometricSIA.</w:t>
-      </w:r>
-    </w:p>
-    <w:p>
-      <w:pPr>
-        <w:spacing w:before="80"/>
-        <w:ind w:left="432"/>
-      </w:pPr>
-      <w:r>
-        <w:rPr>
-          <w:rFonts w:ascii="Calibri" w:hAnsi="Calibri"/>
-          <w:b/>
-          <w:i w:val="0"/>
-          <w:color w:val="BF8F00"/>
-          <w:sz w:val="21"/>
-        </w:rPr>
-        <w:t xml:space="preserve">⌨  HACER: </w:t>
-      </w:r>
-      <w:r>
-        <w:rPr>
-          <w:rFonts w:ascii="Calibri" w:hAnsi="Calibri"/>
-          <w:b w:val="0"/>
-          <w:i w:val="0"/>
-          <w:color w:val="000000"/>
-          <w:sz w:val="21"/>
-        </w:rPr>
-        <w:t>Seleccionar N2A.csv (número 1), confirmar, estado 00, algoritmo 2, k=2</w:t>
-      </w:r>
-    </w:p>
-    <w:p>
-      <w:pPr>
-        <w:spacing w:before="80"/>
-        <w:ind w:left="432"/>
-      </w:pPr>
-      <w:r>
-        <w:rPr>
-          <w:rFonts w:ascii="Calibri" w:hAnsi="Calibri"/>
-          <w:b/>
-          <w:i w:val="0"/>
-          <w:color w:val="404040"/>
-          <w:sz w:val="21"/>
-        </w:rPr>
-        <w:t xml:space="preserve">⏳ ESPERAR: </w:t>
-      </w:r>
-      <w:r>
-        <w:rPr>
-          <w:rFonts w:ascii="Calibri" w:hAnsi="Calibri"/>
-          <w:b w:val="0"/>
-          <w:i/>
-          <w:color w:val="404040"/>
-          <w:sz w:val="21"/>
-        </w:rPr>
-        <w:t>Ver los pasos PASO| de KGeometricSIA.</w:t>
-      </w:r>
-    </w:p>
-    <w:p>
-      <w:pPr>
-        <w:spacing w:before="80"/>
-        <w:ind w:left="432"/>
-      </w:pPr>
-      <w:r>
-        <w:rPr>
-          <w:rFonts w:ascii="Calibri" w:hAnsi="Calibri"/>
-          <w:b/>
-          <w:i w:val="0"/>
-          <w:color w:val="1F5694"/>
-          <w:sz w:val="21"/>
-        </w:rPr>
-        <w:t xml:space="preserve">🎤 DECIR: </w:t>
-      </w:r>
-      <w:r>
-        <w:rPr>
-          <w:rFonts w:ascii="Calibri" w:hAnsi="Calibri"/>
-          <w:b w:val="0"/>
-          <w:i/>
-          <w:color w:val="404040"/>
-          <w:sz w:val="21"/>
-        </w:rPr>
-        <w:t>KGeometricSIA construye la tabla de costos BFS/DP sobre el hipercubo binario y genera múltiples candidatos mediante cuantiles y k-medoids. Luego evalúa cada candidato con kpartir y selecciona la de menor pérdida.</w:t>
-      </w:r>
-    </w:p>
-    <w:p>
-      <w:pPr>
-        <w:spacing w:before="80"/>
-        <w:ind w:left="432"/>
-      </w:pPr>
-      <w:r>
-        <w:rPr>
-          <w:rFonts w:ascii="Calibri" w:hAnsi="Calibri"/>
-          <w:b/>
-          <w:i w:val="0"/>
-          <w:color w:val="BF8F00"/>
-          <w:sz w:val="21"/>
-        </w:rPr>
-        <w:t xml:space="preserve">⌨  HACER: </w:t>
-      </w:r>
-      <w:r>
-        <w:rPr>
-          <w:rFonts w:ascii="Calibri" w:hAnsi="Calibri"/>
-          <w:b w:val="0"/>
-          <w:i w:val="0"/>
-          <w:color w:val="000000"/>
-          <w:sz w:val="21"/>
-        </w:rPr>
-        <w:t>No guardar. Salir con N [ENTER]</w:t>
-      </w:r>
-    </w:p>
-    <w:p>
-      <w:pPr>
-        <w:pStyle w:val="Heading2"/>
-      </w:pPr>
-      <w:r>
-        <w:rPr>
-          <w:rFonts w:ascii="Calibri" w:hAnsi="Calibri"/>
-          <w:color w:val="2E75B6"/>
-          <w:sz w:val="26"/>
-        </w:rPr>
-        <w:t>SEGMENTO 5 — Cierre y referencias (8:00 – 9:30)</w:t>
-      </w:r>
-    </w:p>
-    <w:p>
-      <w:pPr>
-        <w:spacing w:before="80"/>
-        <w:ind w:left="432"/>
-      </w:pPr>
-      <w:r>
-        <w:rPr>
-          <w:rFonts w:ascii="Calibri" w:hAnsi="Calibri"/>
-          <w:b/>
-          <w:i w:val="0"/>
-          <w:color w:val="378637"/>
-          <w:sz w:val="21"/>
-        </w:rPr>
-        <w:t xml:space="preserve">🖥  MOSTRAR: </w:t>
-      </w:r>
-      <w:r>
-        <w:rPr>
-          <w:rFonts w:ascii="Calibri" w:hAnsi="Calibri"/>
-          <w:b w:val="0"/>
-          <w:i w:val="0"/>
-          <w:color w:val="404040"/>
-          <w:sz w:val="21"/>
-        </w:rPr>
-        <w:t>Abrir el PDF 2_GeoMIP.pdf — Capítulo 6 (Perspectivas Futuras).</w:t>
-      </w:r>
-    </w:p>
-    <w:p>
-      <w:pPr>
-        <w:spacing w:before="80"/>
-        <w:ind w:left="432"/>
-      </w:pPr>
-      <w:r>
-        <w:rPr>
-          <w:rFonts w:ascii="Calibri" w:hAnsi="Calibri"/>
-          <w:b/>
-          <w:i w:val="0"/>
-          <w:color w:val="1F5694"/>
-          <w:sz w:val="21"/>
-        </w:rPr>
-        <w:t xml:space="preserve">🎤 DECIR: </w:t>
-      </w:r>
-      <w:r>
-        <w:rPr>
-          <w:rFonts w:ascii="Calibri" w:hAnsi="Calibri"/>
-          <w:b w:val="0"/>
-          <w:i/>
-          <w:color w:val="404040"/>
-          <w:sz w:val="21"/>
-        </w:rPr>
-        <w:t>Para cerrar, quiero destacar que la extensión a k-particiones que implementamos estaba propuesta como 'Desarrollo Futuro' en el Capítulo 6 del documento GeoMIP. Logramos convertir esa propuesta teórica en implementación funcional y validada.</w:t>
-      </w:r>
-    </w:p>
-    <w:p>
-      <w:pPr>
-        <w:spacing w:before="80"/>
-        <w:ind w:left="432"/>
-      </w:pPr>
-      <w:r>
-        <w:rPr>
-          <w:rFonts w:ascii="Calibri" w:hAnsi="Calibri"/>
-          <w:b/>
-          <w:i w:val="0"/>
-          <w:color w:val="378637"/>
-          <w:sz w:val="21"/>
-        </w:rPr>
-        <w:t xml:space="preserve">🖥  MOSTRAR: </w:t>
-      </w:r>
-      <w:r>
-        <w:rPr>
-          <w:rFonts w:ascii="Calibri" w:hAnsi="Calibri"/>
-          <w:b w:val="0"/>
-          <w:i w:val="0"/>
-          <w:color w:val="404040"/>
-          <w:sz w:val="21"/>
-        </w:rPr>
-        <w:t>Volver a la terminal. Mostrar el árbol de archivos del repositorio.</w:t>
-      </w:r>
-    </w:p>
-    <w:p>
-      <w:pPr>
-        <w:spacing w:before="80"/>
-        <w:ind w:left="432"/>
-      </w:pPr>
-      <w:r>
-        <w:rPr>
-          <w:rFonts w:ascii="Calibri" w:hAnsi="Calibri"/>
-          <w:b/>
-          <w:i w:val="0"/>
-          <w:color w:val="1F5694"/>
-          <w:sz w:val="21"/>
-        </w:rPr>
-        <w:t xml:space="preserve">🎤 DECIR: </w:t>
-      </w:r>
-      <w:r>
-        <w:rPr>
-          <w:rFonts w:ascii="Calibri" w:hAnsi="Calibri"/>
-          <w:b w:val="0"/>
-          <w:i/>
-          <w:color w:val="404040"/>
-          <w:sz w:val="21"/>
-        </w:rPr>
-        <w:t>El proyecto entrega: tres módulos con sus suites de tests, una interfaz interactiva completa, documentación técnica, protocolo de verificación y este informe. Todos los 16 tests pasan y el sistema está validado.</w:t>
-      </w:r>
-    </w:p>
-    <w:p>
-      <w:pPr>
-        <w:spacing w:before="80"/>
-        <w:ind w:left="432"/>
-      </w:pPr>
-      <w:r>
-        <w:rPr>
-          <w:rFonts w:ascii="Calibri" w:hAnsi="Calibri"/>
-          <w:b/>
-          <w:i w:val="0"/>
-          <w:color w:val="1F5694"/>
-          <w:sz w:val="21"/>
-        </w:rPr>
-        <w:t xml:space="preserve">🎤 DECIR: </w:t>
-      </w:r>
-      <w:r>
-        <w:rPr>
-          <w:rFonts w:ascii="Calibri" w:hAnsi="Calibri"/>
-          <w:b w:val="0"/>
-          <w:i/>
-          <w:color w:val="404040"/>
-          <w:sz w:val="21"/>
-        </w:rPr>
-        <w:t>Muchas gracias. Si tienen preguntas, pueden revisar el README.md o el Protocolo de Verificación incluido en el repositorio.</w:t>
-      </w:r>
-    </w:p>
-    <w:p>
-      <w:r>
-        <w:br w:type="page"/>
-      </w:r>
-    </w:p>
-    <w:p>
-      <w:pPr>
-        <w:pStyle w:val="Heading1"/>
-      </w:pPr>
-      <w:r>
-        <w:rPr>
-          <w:rFonts w:ascii="Calibri" w:hAnsi="Calibri"/>
-          <w:color w:val="1F5694"/>
-          <w:sz w:val="32"/>
-        </w:rPr>
-        <w:t>CONSEJOS PARA LA GRABACIÓN</w:t>
+        <w:t>NOTAS PARA LOS PRESENTADORES</w:t>
+        <w:br/>
       </w:r>
     </w:p>
     <w:p>
       <w:pPr>
         <w:pStyle w:val="ListBullet"/>
-        <w:ind w:left="432"/>
       </w:pPr>
       <w:r>
         <w:rPr>
-          <w:rFonts w:ascii="Calibri" w:hAnsi="Calibri"/>
           <w:b w:val="0"/>
           <w:i w:val="0"/>
-          <w:color w:val="404040"/>
-          <w:sz w:val="21"/>
+          <w:sz w:val="18"/>
         </w:rPr>
-        <w:t>Habla despacio y claramente. Pausa 2 segundos entre secciones.</w:t>
+        <w:t>Ensayen al menos una vez con la máquina real para verificar que todos los comandos ejecutan correctamente. Los CSVs de muestra deben estar en K-QGMIP_Final/QNodes/src/.samples/ y K-QGMIP_Final/GeoMIP/data/samples/.</w:t>
       </w:r>
     </w:p>
     <w:p>
       <w:pPr>
         <w:pStyle w:val="ListBullet"/>
-        <w:ind w:left="432"/>
       </w:pPr>
       <w:r>
         <w:rPr>
-          <w:rFonts w:ascii="Calibri" w:hAnsi="Calibri"/>
           <w:b w:val="0"/>
           <w:i w:val="0"/>
-          <w:color w:val="404040"/>
-          <w:sz w:val="21"/>
+          <w:sz w:val="18"/>
         </w:rPr>
-        <w:t>Si te equivocas escribiendo un comando, edita en silencio y continúa — no hace falta reiniciar la grabación.</w:t>
+        <w:t>Si interfaz_kqmip.py tarda más de 30 segundos en un sistema grande, consideren usar N3A.csv (3 nodos) para la demostración en vivo y mencionar que N4D.csv se ejecutó antes del video para los resultados comparativos.</w:t>
       </w:r>
     </w:p>
     <w:p>
       <w:pPr>
         <w:pStyle w:val="ListBullet"/>
-        <w:ind w:left="432"/>
       </w:pPr>
       <w:r>
         <w:rPr>
-          <w:rFonts w:ascii="Calibri" w:hAnsi="Calibri"/>
           <w:b w:val="0"/>
           <w:i w:val="0"/>
-          <w:color w:val="404040"/>
-          <w:sz w:val="21"/>
+          <w:sz w:val="18"/>
         </w:rPr>
-        <w:t>El video no necesita ser perfecto. Lo importante es que se vea SISTEMA VALIDADO y la tabla de resultados.</w:t>
+        <w:t>El flujo de stdout estructurado (FASE|PASO|RESULTADO) está diseñado para ser legible en cámara. Amplíen el tamaño de fuente del terminal a 14pt mínimo.</w:t>
       </w:r>
     </w:p>
     <w:p>
       <w:pPr>
         <w:pStyle w:val="ListBullet"/>
-        <w:ind w:left="432"/>
       </w:pPr>
       <w:r>
         <w:rPr>
-          <w:rFonts w:ascii="Calibri" w:hAnsi="Calibri"/>
           <w:b w:val="0"/>
           <w:i w:val="0"/>
-          <w:color w:val="404040"/>
-          <w:sz w:val="21"/>
+          <w:sz w:val="18"/>
         </w:rPr>
-        <w:t>Si KGeometricSIA tarda más de 30 segundos, muestra el progreso y comenta que está calculando la tabla BFS/DP.</w:t>
+        <w:t>La explicación de marginalización (Sección 2, bloque de P2 en 1:40) es el punto conceptual más crítico para los criterios del profesor. No omitirla.</w:t>
       </w:r>
     </w:p>
     <w:p>
       <w:pPr>
         <w:pStyle w:val="ListBullet"/>
-        <w:ind w:left="432"/>
       </w:pPr>
       <w:r>
         <w:rPr>
-          <w:rFonts w:ascii="Calibri" w:hAnsi="Calibri"/>
           <w:b w:val="0"/>
           <w:i w:val="0"/>
-          <w:color w:val="404040"/>
-          <w:sz w:val="21"/>
+          <w:sz w:val="18"/>
         </w:rPr>
-        <w:t>Puedes acelerar el video en post-edición durante las esperas largas.</w:t>
+        <w:t>Los perfiles HTML vacíos en review/profiling/ son normales para sistemas pequeños — menciónenlo solo si el profesor pregunta; no hace falta señalarlo proactivamente.</w:t>
       </w:r>
     </w:p>
+    <w:p/>
     <w:p>
       <w:pPr>
-        <w:pStyle w:val="ListBullet"/>
-        <w:ind w:left="432"/>
+        <w:jc w:val="center"/>
       </w:pPr>
       <w:r>
         <w:rPr>
-          <w:rFonts w:ascii="Calibri" w:hAnsi="Calibri"/>
           <w:b w:val="0"/>
-          <w:i w:val="0"/>
-          <w:color w:val="404040"/>
-          <w:sz w:val="21"/>
+          <w:i/>
+          <w:color w:val="7F7F7F"/>
+          <w:sz w:val="16"/>
         </w:rPr>
-        <w:t>Dura máximo 12 minutos. Si te extiendes, recorta el segmento de tests individuales.</w:t>
+        <w:t>K-QGMIP · Guion Video Tutorial · Universidad de Caldas · 2025</w:t>
       </w:r>
     </w:p>
     <w:sectPr>
       <w:pgSz w:w="12240" w:h="15840"/>
-      <w:pgMar w:top="1440" w:right="1656" w:bottom="1440" w:left="1656" w:header="720" w:footer="720" w:gutter="0"/>
+      <w:pgMar w:top="1440" w:right="1440" w:bottom="1440" w:left="1440" w:header="720" w:footer="720" w:gutter="0"/>
       <w:cols w:space="720"/>
       <w:docGrid w:linePitch="360"/>
     </w:sectPr>
@@ -1911,6 +2811,10 @@
     <w:name w:val="Normal"/>
     <w:qFormat/>
     <w:rsid w:val="00FC693F"/>
+    <w:rPr>
+      <w:rFonts w:ascii="Arial" w:hAnsi="Arial"/>
+      <w:sz w:val="20"/>
+    </w:rPr>
   </w:style>
   <w:style w:type="paragraph" w:styleId="Header">
     <w:name w:val="header"/>

</xml_diff>